<commit_message>
add Will's individual contribution summary to Assignment 3
</commit_message>
<xml_diff>
--- a/documents/Assignment 3.docx
+++ b/documents/Assignment 3.docx
@@ -930,9 +930,19 @@
           <w:rFonts w:ascii="Times New Roman" w:eastAsia="Times New Roman" w:hAnsi="Times New Roman"/>
           <w:sz w:val="24"/>
           <w:szCs w:val="24"/>
+          <w:highlight w:val="yellow"/>
           <w:lang w:val="vi-VN"/>
         </w:rPr>
-        <w:t xml:space="preserve">Jira: </w:t>
+        <w:t>Jira:</w:t>
+      </w:r>
+      <w:r>
+        <w:rPr>
+          <w:rFonts w:ascii="Times New Roman" w:eastAsia="Times New Roman" w:hAnsi="Times New Roman"/>
+          <w:sz w:val="24"/>
+          <w:szCs w:val="24"/>
+          <w:lang w:val="vi-VN"/>
+        </w:rPr>
+        <w:t xml:space="preserve"> </w:t>
       </w:r>
     </w:p>
     <w:p>
@@ -1494,25 +1504,7 @@
             <w:sz w:val="24"/>
             <w:szCs w:val="24"/>
           </w:rPr>
-          <w:t>https://github.com/HendrickDang/PRT661-DATA-SCIENCE-PRACTICE/commits?author=Hendrick</w:t>
-        </w:r>
-        <w:r>
-          <w:rPr>
-            <w:rStyle w:val="Hyperlink"/>
-            <w:rFonts w:ascii="Times New Roman" w:eastAsia="Times New Roman" w:hAnsi="Times New Roman"/>
-            <w:sz w:val="24"/>
-            <w:szCs w:val="24"/>
-          </w:rPr>
-          <w:t>D</w:t>
-        </w:r>
-        <w:r>
-          <w:rPr>
-            <w:rStyle w:val="Hyperlink"/>
-            <w:rFonts w:ascii="Times New Roman" w:eastAsia="Times New Roman" w:hAnsi="Times New Roman"/>
-            <w:sz w:val="24"/>
-            <w:szCs w:val="24"/>
-          </w:rPr>
-          <w:t>ang</w:t>
+          <w:t>https://github.com/HendrickDang/PRT661-DATA-SCIENCE-PRACTICE/commits?author=HendrickDang</w:t>
         </w:r>
       </w:hyperlink>
     </w:p>
@@ -1540,25 +1532,7 @@
             <w:sz w:val="24"/>
             <w:szCs w:val="24"/>
           </w:rPr>
-          <w:t>https://github.com/He</w:t>
-        </w:r>
-        <w:r>
-          <w:rPr>
-            <w:rStyle w:val="Hyperlink"/>
-            <w:rFonts w:ascii="Times New Roman" w:eastAsia="Times New Roman" w:hAnsi="Times New Roman"/>
-            <w:sz w:val="24"/>
-            <w:szCs w:val="24"/>
-          </w:rPr>
-          <w:t>n</w:t>
-        </w:r>
-        <w:r>
-          <w:rPr>
-            <w:rStyle w:val="Hyperlink"/>
-            <w:rFonts w:ascii="Times New Roman" w:eastAsia="Times New Roman" w:hAnsi="Times New Roman"/>
-            <w:sz w:val="24"/>
-            <w:szCs w:val="24"/>
-          </w:rPr>
-          <w:t>drickDang/PRT661-DATA-SCIENCE-PRACTICE/commits/main/evaluation.py</w:t>
+          <w:t>https://github.com/HendrickDang/PRT661-DATA-SCIENCE-PRACTICE/commits/main/evaluation.py</w:t>
         </w:r>
       </w:hyperlink>
     </w:p>
@@ -1586,25 +1560,7 @@
             <w:sz w:val="24"/>
             <w:szCs w:val="24"/>
           </w:rPr>
-          <w:t>https://github.com/HendrickD</w:t>
-        </w:r>
-        <w:r>
-          <w:rPr>
-            <w:rStyle w:val="Hyperlink"/>
-            <w:rFonts w:ascii="Times New Roman" w:eastAsia="Times New Roman" w:hAnsi="Times New Roman"/>
-            <w:sz w:val="24"/>
-            <w:szCs w:val="24"/>
-          </w:rPr>
-          <w:t>a</w:t>
-        </w:r>
-        <w:r>
-          <w:rPr>
-            <w:rStyle w:val="Hyperlink"/>
-            <w:rFonts w:ascii="Times New Roman" w:eastAsia="Times New Roman" w:hAnsi="Times New Roman"/>
-            <w:sz w:val="24"/>
-            <w:szCs w:val="24"/>
-          </w:rPr>
-          <w:t>ng/PRT661-DATA-SCIENCE-PRACTICE/commits/main/Outputs</w:t>
+          <w:t>https://github.com/HendrickDang/PRT661-DATA-SCIENCE-PRACTICE/commits/main/Outputs</w:t>
         </w:r>
       </w:hyperlink>
     </w:p>
@@ -1632,25 +1588,7 @@
             <w:sz w:val="24"/>
             <w:szCs w:val="24"/>
           </w:rPr>
-          <w:t>https://githu</w:t>
-        </w:r>
-        <w:r>
-          <w:rPr>
-            <w:rStyle w:val="Hyperlink"/>
-            <w:rFonts w:ascii="Times New Roman" w:eastAsia="Times New Roman" w:hAnsi="Times New Roman"/>
-            <w:sz w:val="24"/>
-            <w:szCs w:val="24"/>
-          </w:rPr>
-          <w:t>b</w:t>
-        </w:r>
-        <w:r>
-          <w:rPr>
-            <w:rStyle w:val="Hyperlink"/>
-            <w:rFonts w:ascii="Times New Roman" w:eastAsia="Times New Roman" w:hAnsi="Times New Roman"/>
-            <w:sz w:val="24"/>
-            <w:szCs w:val="24"/>
-          </w:rPr>
-          <w:t>.com/HendrickDang/PRT661-DATA-SCIENCE-PRACTICE/commits/main/Reports/PRT661_Assessment_3.pptx</w:t>
+          <w:t>https://github.com/HendrickDang/PRT661-DATA-SCIENCE-PRACTICE/commits/main/Reports/PRT661_Assessment_3.pptx</w:t>
         </w:r>
       </w:hyperlink>
     </w:p>
@@ -1677,26 +1615,9 @@
             <w:rFonts w:ascii="Times New Roman" w:eastAsia="Times New Roman" w:hAnsi="Times New Roman"/>
             <w:sz w:val="24"/>
             <w:szCs w:val="24"/>
+            <w:highlight w:val="yellow"/>
           </w:rPr>
-          <w:t>https://hendrickdang.atlassian.net/jira/softw</w:t>
-        </w:r>
-        <w:r>
-          <w:rPr>
-            <w:rStyle w:val="Hyperlink"/>
-            <w:rFonts w:ascii="Times New Roman" w:eastAsia="Times New Roman" w:hAnsi="Times New Roman"/>
-            <w:sz w:val="24"/>
-            <w:szCs w:val="24"/>
-          </w:rPr>
-          <w:t>a</w:t>
-        </w:r>
-        <w:r>
-          <w:rPr>
-            <w:rStyle w:val="Hyperlink"/>
-            <w:rFonts w:ascii="Times New Roman" w:eastAsia="Times New Roman" w:hAnsi="Times New Roman"/>
-            <w:sz w:val="24"/>
-            <w:szCs w:val="24"/>
-          </w:rPr>
-          <w:t>re/projects/SCRUM/boards/1/timeline</w:t>
+          <w:t>https://hendrickdang.atlassian.net/jira/software/projects/SCRUM/boards/1/timeline</w:t>
         </w:r>
       </w:hyperlink>
     </w:p>
@@ -1977,21 +1898,592 @@
     </w:p>
     <w:p>
       <w:pPr>
-        <w:pStyle w:val="NormalWeb"/>
+        <w:pStyle w:val="ListParagraph"/>
         <w:numPr>
           <w:ilvl w:val="0"/>
           <w:numId w:val="21"/>
         </w:numPr>
-        <w:spacing w:before="0" w:beforeAutospacing="0" w:after="0" w:afterAutospacing="0" w:line="276" w:lineRule="auto"/>
+        <w:rPr>
+          <w:rFonts w:ascii="Times New Roman" w:eastAsia="Times New Roman" w:hAnsi="Times New Roman"/>
+          <w:b/>
+          <w:bCs/>
+          <w:sz w:val="24"/>
+          <w:szCs w:val="24"/>
+          <w:lang w:val="vi-VN"/>
+        </w:rPr>
+      </w:pPr>
+      <w:r>
+        <w:rPr>
+          <w:rFonts w:ascii="Times New Roman" w:eastAsia="Times New Roman" w:hAnsi="Times New Roman"/>
+          <w:b/>
+          <w:bCs/>
+          <w:sz w:val="24"/>
+          <w:szCs w:val="24"/>
+          <w:lang w:val="vi-VN"/>
+        </w:rPr>
+        <w:lastRenderedPageBreak/>
+        <w:t>Student Information</w:t>
+      </w:r>
+    </w:p>
+    <w:p>
+      <w:pPr>
+        <w:spacing w:line="276" w:lineRule="auto"/>
+        <w:ind w:left="426"/>
         <w:jc w:val="both"/>
         <w:rPr>
-          <w:lang w:val="en-AU"/>
+          <w:rFonts w:ascii="Times New Roman" w:eastAsia="Times New Roman" w:hAnsi="Times New Roman"/>
+          <w:sz w:val="24"/>
+          <w:szCs w:val="24"/>
+        </w:rPr>
+      </w:pPr>
+    </w:p>
+    <w:p>
+      <w:pPr>
+        <w:spacing w:line="276" w:lineRule="auto"/>
+        <w:ind w:left="426"/>
+        <w:jc w:val="both"/>
+        <w:rPr>
+          <w:rFonts w:ascii="Times New Roman" w:eastAsia="Times New Roman" w:hAnsi="Times New Roman"/>
+          <w:sz w:val="24"/>
+          <w:szCs w:val="24"/>
+        </w:rPr>
+      </w:pPr>
+      <w:r>
+        <w:rPr>
+          <w:rFonts w:ascii="Times New Roman" w:eastAsia="Times New Roman" w:hAnsi="Times New Roman"/>
+          <w:sz w:val="24"/>
+          <w:szCs w:val="24"/>
+        </w:rPr>
+        <w:t>Name: Ngoc Anh</w:t>
+      </w:r>
+      <w:r>
+        <w:rPr>
+          <w:rFonts w:ascii="Times New Roman" w:eastAsia="Times New Roman" w:hAnsi="Times New Roman"/>
+          <w:sz w:val="24"/>
+          <w:szCs w:val="24"/>
+        </w:rPr>
+        <w:t xml:space="preserve"> </w:t>
+      </w:r>
+      <w:r>
+        <w:rPr>
+          <w:rFonts w:ascii="Times New Roman" w:eastAsia="Times New Roman" w:hAnsi="Times New Roman"/>
+          <w:sz w:val="24"/>
+          <w:szCs w:val="24"/>
+        </w:rPr>
+        <w:t xml:space="preserve">(Will) </w:t>
+      </w:r>
+      <w:r>
+        <w:rPr>
+          <w:rFonts w:ascii="Times New Roman" w:eastAsia="Times New Roman" w:hAnsi="Times New Roman"/>
+          <w:sz w:val="24"/>
+          <w:szCs w:val="24"/>
+        </w:rPr>
+        <w:t>Nguyen - Student ID: S386805</w:t>
+      </w:r>
+    </w:p>
+    <w:p>
+      <w:pPr>
+        <w:spacing w:line="276" w:lineRule="auto"/>
+        <w:ind w:left="426"/>
+        <w:jc w:val="both"/>
+      </w:pPr>
+      <w:r>
+        <w:rPr>
+          <w:rFonts w:ascii="Times New Roman" w:eastAsia="Times New Roman" w:hAnsi="Times New Roman"/>
+          <w:sz w:val="24"/>
+          <w:szCs w:val="24"/>
+        </w:rPr>
+        <w:t>Role: Data Engineering</w:t>
+      </w:r>
+    </w:p>
+    <w:p>
+      <w:pPr>
+        <w:spacing w:after="160" w:line="276" w:lineRule="auto"/>
+        <w:contextualSpacing/>
+        <w:jc w:val="both"/>
+        <w:rPr>
+          <w:rFonts w:ascii="Times New Roman" w:eastAsia="Times New Roman" w:hAnsi="Times New Roman" w:cs="Arial"/>
+          <w:b/>
+          <w:bCs/>
+          <w:sz w:val="24"/>
+          <w:szCs w:val="24"/>
+          <w:lang w:eastAsia="en-US"/>
+        </w:rPr>
+      </w:pPr>
+      <w:r>
+        <w:rPr>
+          <w:rFonts w:ascii="Times New Roman" w:eastAsia="Times New Roman" w:hAnsi="Times New Roman" w:cs="Arial"/>
+          <w:b/>
+          <w:bCs/>
+          <w:sz w:val="24"/>
+          <w:szCs w:val="24"/>
+          <w:lang w:eastAsia="en-US"/>
+        </w:rPr>
+        <w:t>Individual Project Contribution</w:t>
+      </w:r>
+    </w:p>
+    <w:p>
+      <w:pPr>
+        <w:pStyle w:val="NormalWeb"/>
+      </w:pPr>
+      <w:r>
+        <w:t>My role is data engineering. I own the ingest and storage stages that every later stage depends on: the ingest stage loads the six source files, runs structural checks and logs each run in manifest.json, while the source → raw → processed layout keeps the original downloads untouched.</w:t>
+      </w:r>
+    </w:p>
+    <w:p>
+      <w:pPr>
+        <w:pStyle w:val="NormalWeb"/>
+      </w:pPr>
+      <w:r>
+        <w:t xml:space="preserve">Since Assessment 2, I built a read-only data lineage and reproducibility audit (pull request #8). It traces every row count from 55,146 raw crime rows to the 696-row model panel (504 train, 192 test), showing that our slides misstate the record count and that training actually starts in 2016, not 2015. A clean-clone rerun with pinned versions reproduced the linear models exactly; XGBoost gave 80.7 instead of 84.5 RMSE per 100k on another platform, but our conclusions hold. </w:t>
+      </w:r>
+    </w:p>
+    <w:p>
+      <w:pPr>
+        <w:pStyle w:val="NormalWeb"/>
+      </w:pPr>
+      <w:r>
+        <w:t>Most importantly, it found that Alcohol_offences and DV_offences are counted from the same month as the target (49% and 64% of target offences, correlation up to 0.97). This is a leakage risk for the single-split results but not for the rolling-origin backtest, and I documented it with a suggested fix. For Assessment 3, I also prepared the first draft of the slide deck and present slides 1 to 6.</w:t>
+      </w:r>
+    </w:p>
+    <w:p>
+      <w:pPr>
+        <w:pStyle w:val="ListParagraph"/>
+        <w:spacing w:after="0" w:line="276" w:lineRule="auto"/>
+        <w:ind w:left="0"/>
+        <w:jc w:val="both"/>
+        <w:rPr>
+          <w:rFonts w:ascii="Times New Roman" w:eastAsia="Times New Roman" w:hAnsi="Times New Roman"/>
+          <w:b/>
+          <w:bCs/>
+          <w:sz w:val="24"/>
+          <w:szCs w:val="24"/>
+          <w:lang w:val="en-AU"/>
+        </w:rPr>
+      </w:pPr>
+      <w:r>
+        <w:rPr>
+          <w:rFonts w:ascii="Times New Roman" w:eastAsia="Times New Roman" w:hAnsi="Times New Roman"/>
+          <w:b/>
+          <w:bCs/>
+          <w:sz w:val="24"/>
+          <w:szCs w:val="24"/>
+          <w:lang w:val="en-AU"/>
+        </w:rPr>
+        <w:t>Supporting Evidence</w:t>
+      </w:r>
+    </w:p>
+    <w:p>
+      <w:pPr>
+        <w:pStyle w:val="ListParagraph"/>
+        <w:spacing w:after="0" w:line="276" w:lineRule="auto"/>
+        <w:ind w:left="0"/>
+      </w:pPr>
+      <w:r>
+        <w:rPr>
+          <w:rFonts w:ascii="Times New Roman" w:eastAsia="Times New Roman" w:hAnsi="Times New Roman"/>
+          <w:sz w:val="24"/>
+          <w:szCs w:val="24"/>
+          <w:lang w:val="en-AU"/>
+        </w:rPr>
+        <w:t xml:space="preserve">GitHub commits: </w:t>
+      </w:r>
+      <w:hyperlink r:id="rId22" w:history="1">
+        <w:r>
+          <w:rPr>
+            <w:rStyle w:val="Hyperlink"/>
+            <w:rFonts w:ascii="Times New Roman" w:eastAsia="Times New Roman" w:hAnsi="Times New Roman"/>
+            <w:sz w:val="24"/>
+            <w:szCs w:val="24"/>
+          </w:rPr>
+          <w:t>https://github.com/HendrickDang/PRT661-DATA-SCIENCE-PRACTICE/commits?author=ngocanh8585</w:t>
+        </w:r>
+      </w:hyperlink>
+    </w:p>
+    <w:p>
+      <w:pPr>
+        <w:pStyle w:val="ListParagraph"/>
+        <w:spacing w:after="0" w:line="276" w:lineRule="auto"/>
+        <w:ind w:left="0"/>
+      </w:pPr>
+      <w:r>
+        <w:rPr>
+          <w:rFonts w:ascii="Times New Roman" w:eastAsia="Times New Roman" w:hAnsi="Times New Roman"/>
+          <w:sz w:val="24"/>
+          <w:szCs w:val="24"/>
+          <w:lang w:val="en-AU"/>
+        </w:rPr>
+        <w:t xml:space="preserve">Data audit (pull request #8): </w:t>
+      </w:r>
+      <w:hyperlink r:id="rId23" w:history="1">
+        <w:r>
+          <w:rPr>
+            <w:rStyle w:val="Hyperlink"/>
+            <w:rFonts w:ascii="Times New Roman" w:eastAsia="Times New Roman" w:hAnsi="Times New Roman"/>
+            <w:sz w:val="24"/>
+            <w:szCs w:val="24"/>
+          </w:rPr>
+          <w:t>https://github.com/HendrickDang/PRT661-DATA-SCIENCE-PRACTICE/pull/8</w:t>
+        </w:r>
+      </w:hyperlink>
+    </w:p>
+    <w:p>
+      <w:pPr>
+        <w:pStyle w:val="ListParagraph"/>
+        <w:spacing w:after="0" w:line="276" w:lineRule="auto"/>
+        <w:ind w:left="0"/>
+      </w:pPr>
+      <w:r>
+        <w:rPr>
+          <w:rFonts w:ascii="Times New Roman" w:eastAsia="Times New Roman" w:hAnsi="Times New Roman"/>
+          <w:sz w:val="24"/>
+          <w:szCs w:val="24"/>
+          <w:lang w:val="en-AU"/>
+        </w:rPr>
+        <w:t xml:space="preserve">Audit report: </w:t>
+      </w:r>
+      <w:hyperlink r:id="rId24" w:history="1">
+        <w:r>
+          <w:rPr>
+            <w:rStyle w:val="Hyperlink"/>
+            <w:rFonts w:ascii="Times New Roman" w:eastAsia="Times New Roman" w:hAnsi="Times New Roman"/>
+            <w:sz w:val="24"/>
+            <w:szCs w:val="24"/>
+          </w:rPr>
+          <w:t>https://github.com/HendrickDang/PRT661-DATA-SCIENCE-PRACTICE/blob/main/audit/README.md</w:t>
+        </w:r>
+      </w:hyperlink>
+    </w:p>
+    <w:p>
+      <w:pPr>
+        <w:pStyle w:val="ListParagraph"/>
+        <w:spacing w:after="0" w:line="276" w:lineRule="auto"/>
+        <w:ind w:left="0"/>
+      </w:pPr>
+      <w:r>
+        <w:rPr>
+          <w:rFonts w:ascii="Times New Roman" w:eastAsia="Times New Roman" w:hAnsi="Times New Roman"/>
+          <w:sz w:val="24"/>
+          <w:szCs w:val="24"/>
+          <w:lang w:val="en-AU"/>
+        </w:rPr>
+        <w:t xml:space="preserve">Ingest stage: </w:t>
+      </w:r>
+      <w:hyperlink r:id="rId25" w:history="1">
+        <w:r>
+          <w:rPr>
+            <w:rStyle w:val="Hyperlink"/>
+            <w:rFonts w:ascii="Times New Roman" w:eastAsia="Times New Roman" w:hAnsi="Times New Roman"/>
+            <w:sz w:val="24"/>
+            <w:szCs w:val="24"/>
+          </w:rPr>
+          <w:t>https://github.com/HendrickDang/PRT661-DATA-SCIENCE-PRACTICE/commit/4b0049771fd511e687b70527adf292f373e6c654</w:t>
+        </w:r>
+      </w:hyperlink>
+    </w:p>
+    <w:p>
+      <w:pPr>
+        <w:pStyle w:val="ListParagraph"/>
+        <w:spacing w:after="0" w:line="276" w:lineRule="auto"/>
+        <w:ind w:left="0"/>
+      </w:pPr>
+      <w:r>
+        <w:rPr>
+          <w:rFonts w:ascii="Times New Roman" w:eastAsia="Times New Roman" w:hAnsi="Times New Roman"/>
+          <w:sz w:val="24"/>
+          <w:szCs w:val="24"/>
+          <w:highlight w:val="yellow"/>
+          <w:lang w:val="en-AU"/>
+        </w:rPr>
+        <w:t>Jira:</w:t>
+      </w:r>
+      <w:r>
+        <w:rPr>
+          <w:rFonts w:ascii="Times New Roman" w:eastAsia="Times New Roman" w:hAnsi="Times New Roman"/>
+          <w:sz w:val="24"/>
+          <w:szCs w:val="24"/>
+          <w:lang w:val="en-AU"/>
+        </w:rPr>
+        <w:t xml:space="preserve"> </w:t>
+      </w:r>
+    </w:p>
+    <w:p>
+      <w:pPr>
+        <w:pStyle w:val="ListParagraph"/>
+        <w:spacing w:line="276" w:lineRule="auto"/>
+        <w:ind w:left="0"/>
+        <w:jc w:val="both"/>
+        <w:rPr>
+          <w:rFonts w:ascii="Times New Roman" w:eastAsia="Times New Roman" w:hAnsi="Times New Roman"/>
+          <w:b/>
+          <w:bCs/>
+          <w:sz w:val="24"/>
+          <w:szCs w:val="24"/>
+          <w:lang w:val="en-AU"/>
+        </w:rPr>
+      </w:pPr>
+    </w:p>
+    <w:p>
+      <w:pPr>
+        <w:pStyle w:val="ListParagraph"/>
+        <w:spacing w:line="276" w:lineRule="auto"/>
+        <w:ind w:left="0"/>
+        <w:jc w:val="both"/>
+        <w:rPr>
+          <w:rFonts w:ascii="Times New Roman" w:eastAsia="Times New Roman" w:hAnsi="Times New Roman" w:cs="Times New Roman"/>
+          <w:b/>
+          <w:bCs/>
+          <w:sz w:val="24"/>
+          <w:szCs w:val="24"/>
+          <w:lang w:val="en-AU"/>
+        </w:rPr>
+      </w:pPr>
+      <w:r>
+        <w:rPr>
+          <w:rFonts w:ascii="Times New Roman" w:eastAsia="Times New Roman" w:hAnsi="Times New Roman" w:cs="Times New Roman"/>
+          <w:b/>
+          <w:bCs/>
+          <w:sz w:val="24"/>
+          <w:szCs w:val="24"/>
+          <w:lang w:val="en-AU"/>
+        </w:rPr>
+        <w:t>Planned Work Before Assessment 4</w:t>
+      </w:r>
+    </w:p>
+    <w:p>
+      <w:pPr>
+        <w:pStyle w:val="ListParagraph"/>
+        <w:spacing w:line="276" w:lineRule="auto"/>
+        <w:ind w:left="0"/>
+        <w:jc w:val="both"/>
+        <w:rPr>
+          <w:rFonts w:ascii="Times New Roman" w:eastAsia="Times New Roman" w:hAnsi="Times New Roman"/>
+          <w:sz w:val="24"/>
+          <w:szCs w:val="24"/>
+          <w:lang w:val="en-AU"/>
+        </w:rPr>
+      </w:pPr>
+      <w:r>
+        <w:rPr>
+          <w:rFonts w:ascii="Times New Roman" w:eastAsia="Times New Roman" w:hAnsi="Times New Roman"/>
+          <w:sz w:val="24"/>
+          <w:szCs w:val="24"/>
+          <w:lang w:val="en-AU"/>
+        </w:rPr>
+        <w:t>Before Assessment 4, I will turn the audit's header-drift check into an automated schema check in ingest, so that drift like the 'Offence type ' and 'Reporting Region' changes already seen between releases stops the pipeline with a clear error instead of silently corrupting the panel. I will then automate the monthly refresh, starting with the January–April 2026 releases. These are needed by Week 10 for the dashboard and drift monitoring, and they give our models a true out-of-sample test. Finally, I will re-run the audit as a release check and write the data engineering and reproducibility sections of the final report.</w:t>
+      </w:r>
+    </w:p>
+    <w:p>
+      <w:pPr>
+        <w:pStyle w:val="ListParagraph"/>
+        <w:spacing w:after="0" w:line="276" w:lineRule="auto"/>
+        <w:ind w:left="0"/>
+        <w:jc w:val="both"/>
+        <w:rPr>
+          <w:rFonts w:ascii="Times New Roman" w:eastAsia="Times New Roman" w:hAnsi="Times New Roman"/>
+          <w:b/>
+          <w:bCs/>
+          <w:sz w:val="24"/>
+          <w:szCs w:val="24"/>
+          <w:lang w:val="en-AU"/>
+        </w:rPr>
+      </w:pPr>
+    </w:p>
+    <w:p>
+      <w:pPr>
+        <w:pStyle w:val="ListParagraph"/>
+        <w:spacing w:after="0" w:line="276" w:lineRule="auto"/>
+        <w:ind w:left="0"/>
+        <w:jc w:val="both"/>
+        <w:rPr>
+          <w:rFonts w:ascii="Times New Roman" w:eastAsia="Times New Roman" w:hAnsi="Times New Roman"/>
+          <w:b/>
+          <w:bCs/>
+          <w:sz w:val="24"/>
+          <w:szCs w:val="24"/>
+          <w:lang w:val="en-AU"/>
+        </w:rPr>
+      </w:pPr>
+      <w:r>
+        <w:rPr>
+          <w:rFonts w:ascii="Times New Roman" w:eastAsia="Times New Roman" w:hAnsi="Times New Roman"/>
+          <w:b/>
+          <w:bCs/>
+          <w:sz w:val="24"/>
+          <w:szCs w:val="24"/>
+          <w:lang w:val="en-AU"/>
+        </w:rPr>
+        <w:t>Laboratory Completion Evidence of:</w:t>
+      </w:r>
+    </w:p>
+    <w:p>
+      <w:pPr>
+        <w:pStyle w:val="ListParagraph"/>
+        <w:spacing w:line="276" w:lineRule="auto"/>
+        <w:ind w:left="0"/>
+        <w:jc w:val="both"/>
+        <w:rPr>
+          <w:rFonts w:ascii="Times New Roman" w:eastAsia="Times New Roman" w:hAnsi="Times New Roman"/>
+          <w:sz w:val="24"/>
+          <w:szCs w:val="24"/>
+          <w:lang w:val="en-AU"/>
+        </w:rPr>
+      </w:pPr>
+      <w:r>
+        <w:rPr>
+          <w:rFonts w:ascii="Times New Roman" w:eastAsia="Times New Roman" w:hAnsi="Times New Roman"/>
+          <w:sz w:val="24"/>
+          <w:szCs w:val="24"/>
+          <w:lang w:val="en-AU"/>
+        </w:rPr>
+        <w:t>Laboratory 4 - Module 8 Lab: Storing and Analyzing Data by Using Amazon Redshift</w:t>
+      </w:r>
+    </w:p>
+    <w:p>
+      <w:pPr>
+        <w:pStyle w:val="ListParagraph"/>
+        <w:spacing w:line="276" w:lineRule="auto"/>
+        <w:ind w:left="0"/>
+        <w:jc w:val="center"/>
+        <w:rPr>
+          <w:rFonts w:ascii="Times New Roman" w:eastAsia="Times New Roman" w:hAnsi="Times New Roman"/>
+          <w:sz w:val="24"/>
+          <w:szCs w:val="24"/>
+        </w:rPr>
+      </w:pPr>
+      <w:r>
+        <w:rPr>
+          <w:rFonts w:ascii="Times New Roman" w:eastAsia="Times New Roman" w:hAnsi="Times New Roman"/>
+          <w:noProof/>
+          <w:sz w:val="24"/>
+          <w:szCs w:val="24"/>
+        </w:rPr>
+        <w:lastRenderedPageBreak/>
+        <w:drawing>
+          <wp:inline distT="0" distB="0" distL="0" distR="0" wp14:anchorId="7A07F2FB" wp14:editId="40298D35">
+            <wp:extent cx="5746290" cy="3232846"/>
+            <wp:effectExtent l="0" t="0" r="6985" b="5715"/>
+            <wp:docPr id="1286285774" name="Picture 2"/>
+            <wp:cNvGraphicFramePr>
+              <a:graphicFrameLocks xmlns:a="http://schemas.openxmlformats.org/drawingml/2006/main" noChangeAspect="1"/>
+            </wp:cNvGraphicFramePr>
+            <a:graphic xmlns:a="http://schemas.openxmlformats.org/drawingml/2006/main">
+              <a:graphicData uri="http://schemas.openxmlformats.org/drawingml/2006/picture">
+                <pic:pic xmlns:pic="http://schemas.openxmlformats.org/drawingml/2006/picture">
+                  <pic:nvPicPr>
+                    <pic:cNvPr id="0" name="Picture 1"/>
+                    <pic:cNvPicPr>
+                      <a:picLocks noChangeAspect="1" noChangeArrowheads="1"/>
+                    </pic:cNvPicPr>
+                  </pic:nvPicPr>
+                  <pic:blipFill>
+                    <a:blip r:embed="rId26" cstate="print">
+                      <a:extLst>
+                        <a:ext uri="{28A0092B-C50C-407E-A947-70E740481C1C}">
+                          <a14:useLocalDpi xmlns:a14="http://schemas.microsoft.com/office/drawing/2010/main" val="0"/>
+                        </a:ext>
+                      </a:extLst>
+                    </a:blip>
+                    <a:srcRect/>
+                    <a:stretch>
+                      <a:fillRect/>
+                    </a:stretch>
+                  </pic:blipFill>
+                  <pic:spPr bwMode="auto">
+                    <a:xfrm>
+                      <a:off x="0" y="0"/>
+                      <a:ext cx="5768601" cy="3245398"/>
+                    </a:xfrm>
+                    <a:prstGeom prst="rect">
+                      <a:avLst/>
+                    </a:prstGeom>
+                  </pic:spPr>
+                </pic:pic>
+              </a:graphicData>
+            </a:graphic>
+          </wp:inline>
+        </w:drawing>
+      </w:r>
+    </w:p>
+    <w:p>
+      <w:pPr>
+        <w:pStyle w:val="ListParagraph"/>
+        <w:spacing w:after="0" w:line="276" w:lineRule="auto"/>
+        <w:ind w:left="0"/>
+        <w:contextualSpacing w:val="0"/>
+        <w:jc w:val="both"/>
+        <w:rPr>
+          <w:rFonts w:ascii="Times New Roman" w:eastAsia="Times New Roman" w:hAnsi="Times New Roman"/>
+          <w:b/>
+          <w:bCs/>
+          <w:sz w:val="24"/>
+          <w:szCs w:val="24"/>
+          <w:lang w:val="en-AU"/>
+        </w:rPr>
+      </w:pPr>
+    </w:p>
+    <w:p>
+      <w:pPr>
+        <w:pStyle w:val="ListParagraph"/>
+        <w:spacing w:after="0" w:line="276" w:lineRule="auto"/>
+        <w:ind w:left="0"/>
+        <w:contextualSpacing w:val="0"/>
+        <w:jc w:val="both"/>
+        <w:rPr>
+          <w:rFonts w:ascii="Times New Roman" w:eastAsia="Times New Roman" w:hAnsi="Times New Roman"/>
+          <w:b/>
+          <w:bCs/>
+          <w:sz w:val="24"/>
+          <w:szCs w:val="24"/>
+          <w:lang w:val="en-AU"/>
+        </w:rPr>
+      </w:pPr>
+      <w:r>
+        <w:rPr>
+          <w:rFonts w:ascii="Times New Roman" w:eastAsia="Times New Roman" w:hAnsi="Times New Roman"/>
+          <w:b/>
+          <w:bCs/>
+          <w:sz w:val="24"/>
+          <w:szCs w:val="24"/>
+          <w:lang w:val="en-AU"/>
+        </w:rPr>
+        <w:t>Brief Professional Reflection</w:t>
+      </w:r>
+    </w:p>
+    <w:p>
+      <w:pPr>
+        <w:pStyle w:val="NormalWeb"/>
+      </w:pPr>
+      <w:r>
+        <w:t>In this lab I launched a Redshift cluster, attached an IAM role to read from S3, and loaded tables with COPY. The key lesson was separating storage from the warehouse: S3 files are never edited and tables are always rebuilt from them, so every result traces back to a fixed input.</w:t>
+      </w:r>
+    </w:p>
+    <w:p>
+      <w:pPr>
+        <w:pStyle w:val="NormalWeb"/>
+      </w:pPr>
+      <w:r>
+        <w:t>I applied this directly to my role. Our dataset/source folder works like S3: it is never overwritten, and the processed panel is always rebuilt from it. My audit extends the idea by fingerprinting each source file with a SHA-256 hash and counting rows at every stage, so any figure on our slides traces to an exact input. In a PFES cloud deployment, these folders would map to S3, with IAM controlling access.</w:t>
+      </w:r>
+    </w:p>
+    <w:p>
+      <w:pPr>
+        <w:spacing w:after="160" w:line="276" w:lineRule="auto"/>
+        <w:contextualSpacing/>
+        <w:jc w:val="both"/>
+        <w:rPr>
+          <w:rFonts w:ascii="Times New Roman" w:eastAsia="Times New Roman" w:hAnsi="Times New Roman"/>
+          <w:b/>
+          <w:bCs/>
+          <w:sz w:val="24"/>
+          <w:szCs w:val="24"/>
+          <w:lang w:eastAsia="en-US"/>
         </w:rPr>
       </w:pPr>
     </w:p>
     <w:sectPr>
-      <w:headerReference w:type="default" r:id="rId22"/>
-      <w:footerReference w:type="default" r:id="rId23"/>
+      <w:headerReference w:type="default" r:id="rId27"/>
+      <w:footerReference w:type="default" r:id="rId28"/>
       <w:pgSz w:w="11906" w:h="16838" w:code="9"/>
       <w:pgMar w:top="1440" w:right="1440" w:bottom="1440" w:left="1440" w:header="709" w:footer="709" w:gutter="0"/>
       <w:pgNumType w:start="0"/>
@@ -2240,6 +2732,119 @@
 <file path=word/numbering.xml><?xml version="1.0" encoding="utf-8"?>
 <w:numbering xmlns:wpc="http://schemas.microsoft.com/office/word/2010/wordprocessingCanvas" xmlns:cx="http://schemas.microsoft.com/office/drawing/2014/chartex" xmlns:cx1="http://schemas.microsoft.com/office/drawing/2015/9/8/chartex" xmlns:cx2="http://schemas.microsoft.com/office/drawing/2015/10/21/chartex" xmlns:cx3="http://schemas.microsoft.com/office/drawing/2016/5/9/chartex" xmlns:cx4="http://schemas.microsoft.com/office/drawing/2016/5/10/chartex" xmlns:cx5="http://schemas.microsoft.com/office/drawing/2016/5/11/chartex" xmlns:cx6="http://schemas.microsoft.com/office/drawing/2016/5/12/chartex" xmlns:cx7="http://schemas.microsoft.com/office/drawing/2016/5/13/chartex" xmlns:cx8="http://schemas.microsoft.com/office/drawing/2016/5/14/chartex" xmlns:mc="http://schemas.openxmlformats.org/markup-compatibility/2006" xmlns:aink="http://schemas.microsoft.com/office/drawing/2016/ink" xmlns:am3d="http://schemas.microsoft.com/office/drawing/2017/model3d" xmlns:o="urn:schemas-microsoft-com:office:office" xmlns:oel="http://schemas.microsoft.com/office/2019/extlst" xmlns:r="http://schemas.openxmlformats.org/officeDocument/2006/relationships" xmlns:m="http://schemas.openxmlformats.org/officeDocument/2006/math" xmlns:v="urn:schemas-microsoft-com:vml" xmlns:wp14="http://schemas.microsoft.com/office/word/2010/wordprocessingDrawing" xmlns:wp="http://schemas.openxmlformats.org/drawingml/2006/wordprocessingDrawing" xmlns:w10="urn:schemas-microsoft-com:office:word" xmlns:w="http://schemas.openxmlformats.org/wordprocessingml/2006/main" xmlns:w14="http://schemas.microsoft.com/office/word/2010/wordml" xmlns:w15="http://schemas.microsoft.com/office/word/2012/wordml" xmlns:w16cex="http://schemas.microsoft.com/office/word/2018/wordml/cex" xmlns:w16cid="http://schemas.microsoft.com/office/word/2016/wordml/cid" xmlns:w16="http://schemas.microsoft.com/office/word/2018/wordml" xmlns:w16du="http://schemas.microsoft.com/office/word/2023/wordml/word16du" xmlns:w16sdtdh="http://schemas.microsoft.com/office/word/2020/wordml/sdtdatahash" xmlns:w16sdtfl="http://schemas.microsoft.com/office/word/2024/wordml/sdtformatlock" xmlns:w16se="http://schemas.microsoft.com/office/word/2015/wordml/symex" xmlns:wpg="http://schemas.microsoft.com/office/word/2010/wordprocessingGroup" xmlns:wpi="http://schemas.microsoft.com/office/word/2010/wordprocessingInk" xmlns:wne="http://schemas.microsoft.com/office/word/2006/wordml" xmlns:wps="http://schemas.microsoft.com/office/word/2010/wordprocessingShape" mc:Ignorable="w14 w15 w16se w16cid w16 w16cex w16sdtdh w16sdtfl w16du wp14">
   <w:abstractNum w:abstractNumId="0" w15:restartNumberingAfterBreak="0">
+    <w:nsid w:val="04100891"/>
+    <w:multiLevelType w:val="multilevel"/>
+    <w:tmpl w:val="89DC3896"/>
+    <w:lvl w:ilvl="0">
+      <w:start w:val="1"/>
+      <w:numFmt w:val="decimal"/>
+      <w:lvlText w:val="%1."/>
+      <w:lvlJc w:val="left"/>
+      <w:pPr>
+        <w:tabs>
+          <w:tab w:val="num" w:pos="720"/>
+        </w:tabs>
+        <w:ind w:left="720" w:hanging="360"/>
+      </w:pPr>
+    </w:lvl>
+    <w:lvl w:ilvl="1" w:tentative="1">
+      <w:start w:val="1"/>
+      <w:numFmt w:val="decimal"/>
+      <w:lvlText w:val="%2."/>
+      <w:lvlJc w:val="left"/>
+      <w:pPr>
+        <w:tabs>
+          <w:tab w:val="num" w:pos="1440"/>
+        </w:tabs>
+        <w:ind w:left="1440" w:hanging="360"/>
+      </w:pPr>
+    </w:lvl>
+    <w:lvl w:ilvl="2" w:tentative="1">
+      <w:start w:val="1"/>
+      <w:numFmt w:val="decimal"/>
+      <w:lvlText w:val="%3."/>
+      <w:lvlJc w:val="left"/>
+      <w:pPr>
+        <w:tabs>
+          <w:tab w:val="num" w:pos="2160"/>
+        </w:tabs>
+        <w:ind w:left="2160" w:hanging="360"/>
+      </w:pPr>
+    </w:lvl>
+    <w:lvl w:ilvl="3" w:tentative="1">
+      <w:start w:val="1"/>
+      <w:numFmt w:val="decimal"/>
+      <w:lvlText w:val="%4."/>
+      <w:lvlJc w:val="left"/>
+      <w:pPr>
+        <w:tabs>
+          <w:tab w:val="num" w:pos="2880"/>
+        </w:tabs>
+        <w:ind w:left="2880" w:hanging="360"/>
+      </w:pPr>
+    </w:lvl>
+    <w:lvl w:ilvl="4" w:tentative="1">
+      <w:start w:val="1"/>
+      <w:numFmt w:val="decimal"/>
+      <w:lvlText w:val="%5."/>
+      <w:lvlJc w:val="left"/>
+      <w:pPr>
+        <w:tabs>
+          <w:tab w:val="num" w:pos="3600"/>
+        </w:tabs>
+        <w:ind w:left="3600" w:hanging="360"/>
+      </w:pPr>
+    </w:lvl>
+    <w:lvl w:ilvl="5" w:tentative="1">
+      <w:start w:val="1"/>
+      <w:numFmt w:val="decimal"/>
+      <w:lvlText w:val="%6."/>
+      <w:lvlJc w:val="left"/>
+      <w:pPr>
+        <w:tabs>
+          <w:tab w:val="num" w:pos="4320"/>
+        </w:tabs>
+        <w:ind w:left="4320" w:hanging="360"/>
+      </w:pPr>
+    </w:lvl>
+    <w:lvl w:ilvl="6" w:tentative="1">
+      <w:start w:val="1"/>
+      <w:numFmt w:val="decimal"/>
+      <w:lvlText w:val="%7."/>
+      <w:lvlJc w:val="left"/>
+      <w:pPr>
+        <w:tabs>
+          <w:tab w:val="num" w:pos="5040"/>
+        </w:tabs>
+        <w:ind w:left="5040" w:hanging="360"/>
+      </w:pPr>
+    </w:lvl>
+    <w:lvl w:ilvl="7" w:tentative="1">
+      <w:start w:val="1"/>
+      <w:numFmt w:val="decimal"/>
+      <w:lvlText w:val="%8."/>
+      <w:lvlJc w:val="left"/>
+      <w:pPr>
+        <w:tabs>
+          <w:tab w:val="num" w:pos="5760"/>
+        </w:tabs>
+        <w:ind w:left="5760" w:hanging="360"/>
+      </w:pPr>
+    </w:lvl>
+    <w:lvl w:ilvl="8" w:tentative="1">
+      <w:start w:val="1"/>
+      <w:numFmt w:val="decimal"/>
+      <w:lvlText w:val="%9."/>
+      <w:lvlJc w:val="left"/>
+      <w:pPr>
+        <w:tabs>
+          <w:tab w:val="num" w:pos="6480"/>
+        </w:tabs>
+        <w:ind w:left="6480" w:hanging="360"/>
+      </w:pPr>
+    </w:lvl>
+  </w:abstractNum>
+  <w:abstractNum w:abstractNumId="1" w15:restartNumberingAfterBreak="0">
     <w:nsid w:val="08223D6C"/>
     <w:multiLevelType w:val="hybridMultilevel"/>
     <w:tmpl w:val="D68C57C2"/>
@@ -2325,7 +2930,7 @@
       </w:pPr>
     </w:lvl>
   </w:abstractNum>
-  <w:abstractNum w:abstractNumId="1" w15:restartNumberingAfterBreak="0">
+  <w:abstractNum w:abstractNumId="2" w15:restartNumberingAfterBreak="0">
     <w:nsid w:val="0FA72991"/>
     <w:multiLevelType w:val="multilevel"/>
     <w:tmpl w:val="0C09001F"/>
@@ -2414,7 +3019,7 @@
       </w:pPr>
     </w:lvl>
   </w:abstractNum>
-  <w:abstractNum w:abstractNumId="2" w15:restartNumberingAfterBreak="0">
+  <w:abstractNum w:abstractNumId="3" w15:restartNumberingAfterBreak="0">
     <w:nsid w:val="203A7770"/>
     <w:multiLevelType w:val="hybridMultilevel"/>
     <w:tmpl w:val="927AE7B8"/>
@@ -2500,7 +3105,7 @@
       </w:pPr>
     </w:lvl>
   </w:abstractNum>
-  <w:abstractNum w:abstractNumId="3" w15:restartNumberingAfterBreak="0">
+  <w:abstractNum w:abstractNumId="4" w15:restartNumberingAfterBreak="0">
     <w:nsid w:val="21FD1B61"/>
     <w:multiLevelType w:val="multilevel"/>
     <w:tmpl w:val="3B20C012"/>
@@ -2649,7 +3254,7 @@
       </w:rPr>
     </w:lvl>
   </w:abstractNum>
-  <w:abstractNum w:abstractNumId="4" w15:restartNumberingAfterBreak="0">
+  <w:abstractNum w:abstractNumId="5" w15:restartNumberingAfterBreak="0">
     <w:nsid w:val="290565DB"/>
     <w:multiLevelType w:val="hybridMultilevel"/>
     <w:tmpl w:val="5A7A6C6C"/>
@@ -2762,7 +3367,7 @@
       </w:rPr>
     </w:lvl>
   </w:abstractNum>
-  <w:abstractNum w:abstractNumId="5" w15:restartNumberingAfterBreak="0">
+  <w:abstractNum w:abstractNumId="6" w15:restartNumberingAfterBreak="0">
     <w:nsid w:val="34C05A1D"/>
     <w:multiLevelType w:val="multilevel"/>
     <w:tmpl w:val="9072FD3E"/>
@@ -2911,7 +3516,7 @@
       </w:rPr>
     </w:lvl>
   </w:abstractNum>
-  <w:abstractNum w:abstractNumId="6" w15:restartNumberingAfterBreak="0">
+  <w:abstractNum w:abstractNumId="7" w15:restartNumberingAfterBreak="0">
     <w:nsid w:val="3ED12453"/>
     <w:multiLevelType w:val="multilevel"/>
     <w:tmpl w:val="6E38E9B0"/>
@@ -3060,7 +3665,7 @@
       </w:rPr>
     </w:lvl>
   </w:abstractNum>
-  <w:abstractNum w:abstractNumId="7" w15:restartNumberingAfterBreak="0">
+  <w:abstractNum w:abstractNumId="8" w15:restartNumberingAfterBreak="0">
     <w:nsid w:val="4024703B"/>
     <w:multiLevelType w:val="multilevel"/>
     <w:tmpl w:val="89DC3896"/>
@@ -3173,7 +3778,7 @@
       </w:pPr>
     </w:lvl>
   </w:abstractNum>
-  <w:abstractNum w:abstractNumId="8" w15:restartNumberingAfterBreak="0">
+  <w:abstractNum w:abstractNumId="9" w15:restartNumberingAfterBreak="0">
     <w:nsid w:val="40E2574B"/>
     <w:multiLevelType w:val="multilevel"/>
     <w:tmpl w:val="38B87622"/>
@@ -3322,7 +3927,7 @@
       </w:rPr>
     </w:lvl>
   </w:abstractNum>
-  <w:abstractNum w:abstractNumId="9" w15:restartNumberingAfterBreak="0">
+  <w:abstractNum w:abstractNumId="10" w15:restartNumberingAfterBreak="0">
     <w:nsid w:val="46420B7B"/>
     <w:multiLevelType w:val="hybridMultilevel"/>
     <w:tmpl w:val="5CA80D6C"/>
@@ -3435,7 +4040,7 @@
       </w:rPr>
     </w:lvl>
   </w:abstractNum>
-  <w:abstractNum w:abstractNumId="10" w15:restartNumberingAfterBreak="0">
+  <w:abstractNum w:abstractNumId="11" w15:restartNumberingAfterBreak="0">
     <w:nsid w:val="52D928A8"/>
     <w:multiLevelType w:val="hybridMultilevel"/>
     <w:tmpl w:val="FF646D02"/>
@@ -3548,7 +4153,7 @@
       </w:rPr>
     </w:lvl>
   </w:abstractNum>
-  <w:abstractNum w:abstractNumId="11" w15:restartNumberingAfterBreak="0">
+  <w:abstractNum w:abstractNumId="12" w15:restartNumberingAfterBreak="0">
     <w:nsid w:val="54C66326"/>
     <w:multiLevelType w:val="hybridMultilevel"/>
     <w:tmpl w:val="582CFEB0"/>
@@ -3661,7 +4266,7 @@
       </w:rPr>
     </w:lvl>
   </w:abstractNum>
-  <w:abstractNum w:abstractNumId="12" w15:restartNumberingAfterBreak="0">
+  <w:abstractNum w:abstractNumId="13" w15:restartNumberingAfterBreak="0">
     <w:nsid w:val="5AA53EB6"/>
     <w:multiLevelType w:val="hybridMultilevel"/>
     <w:tmpl w:val="82D6F1CA"/>
@@ -3774,7 +4379,7 @@
       </w:rPr>
     </w:lvl>
   </w:abstractNum>
-  <w:abstractNum w:abstractNumId="13" w15:restartNumberingAfterBreak="0">
+  <w:abstractNum w:abstractNumId="14" w15:restartNumberingAfterBreak="0">
     <w:nsid w:val="5E5415F3"/>
     <w:multiLevelType w:val="hybridMultilevel"/>
     <w:tmpl w:val="AA18DB78"/>
@@ -3887,7 +4492,7 @@
       </w:rPr>
     </w:lvl>
   </w:abstractNum>
-  <w:abstractNum w:abstractNumId="14" w15:restartNumberingAfterBreak="0">
+  <w:abstractNum w:abstractNumId="15" w15:restartNumberingAfterBreak="0">
     <w:nsid w:val="65780B18"/>
     <w:multiLevelType w:val="hybridMultilevel"/>
     <w:tmpl w:val="72C0AFE2"/>
@@ -3976,7 +4581,7 @@
       </w:pPr>
     </w:lvl>
   </w:abstractNum>
-  <w:abstractNum w:abstractNumId="15" w15:restartNumberingAfterBreak="0">
+  <w:abstractNum w:abstractNumId="16" w15:restartNumberingAfterBreak="0">
     <w:nsid w:val="6DE1190A"/>
     <w:multiLevelType w:val="multilevel"/>
     <w:tmpl w:val="70D647A8"/>
@@ -4125,7 +4730,7 @@
       </w:rPr>
     </w:lvl>
   </w:abstractNum>
-  <w:abstractNum w:abstractNumId="16" w15:restartNumberingAfterBreak="0">
+  <w:abstractNum w:abstractNumId="17" w15:restartNumberingAfterBreak="0">
     <w:nsid w:val="713A10E2"/>
     <w:multiLevelType w:val="multilevel"/>
     <w:tmpl w:val="D00603DC"/>
@@ -4274,7 +4879,7 @@
       </w:rPr>
     </w:lvl>
   </w:abstractNum>
-  <w:abstractNum w:abstractNumId="17" w15:restartNumberingAfterBreak="0">
+  <w:abstractNum w:abstractNumId="18" w15:restartNumberingAfterBreak="0">
     <w:nsid w:val="774A202D"/>
     <w:multiLevelType w:val="multilevel"/>
     <w:tmpl w:val="0C325802"/>
@@ -4423,7 +5028,7 @@
       </w:rPr>
     </w:lvl>
   </w:abstractNum>
-  <w:abstractNum w:abstractNumId="18" w15:restartNumberingAfterBreak="0">
+  <w:abstractNum w:abstractNumId="19" w15:restartNumberingAfterBreak="0">
     <w:nsid w:val="79F32998"/>
     <w:multiLevelType w:val="hybridMultilevel"/>
     <w:tmpl w:val="F8B04434"/>
@@ -4512,7 +5117,7 @@
       </w:pPr>
     </w:lvl>
   </w:abstractNum>
-  <w:abstractNum w:abstractNumId="19" w15:restartNumberingAfterBreak="0">
+  <w:abstractNum w:abstractNumId="20" w15:restartNumberingAfterBreak="0">
     <w:nsid w:val="7D72E621"/>
     <w:multiLevelType w:val="hybridMultilevel"/>
     <w:tmpl w:val="1CE0290E"/>
@@ -4625,7 +5230,7 @@
       </w:rPr>
     </w:lvl>
   </w:abstractNum>
-  <w:abstractNum w:abstractNumId="20" w15:restartNumberingAfterBreak="0">
+  <w:abstractNum w:abstractNumId="21" w15:restartNumberingAfterBreak="0">
     <w:nsid w:val="7D823C68"/>
     <w:multiLevelType w:val="multilevel"/>
     <w:tmpl w:val="0C09001F"/>
@@ -4712,70 +5317,73 @@
     </w:lvl>
   </w:abstractNum>
   <w:num w:numId="1" w16cid:durableId="723069717">
+    <w:abstractNumId w:val="21"/>
+  </w:num>
+  <w:num w:numId="2" w16cid:durableId="1868635507">
     <w:abstractNumId w:val="20"/>
   </w:num>
-  <w:num w:numId="2" w16cid:durableId="1868635507">
+  <w:num w:numId="3" w16cid:durableId="869300735">
+    <w:abstractNumId w:val="12"/>
+  </w:num>
+  <w:num w:numId="4" w16cid:durableId="659816737">
+    <w:abstractNumId w:val="1"/>
+  </w:num>
+  <w:num w:numId="5" w16cid:durableId="1126462383">
+    <w:abstractNumId w:val="10"/>
+  </w:num>
+  <w:num w:numId="6" w16cid:durableId="42486870">
     <w:abstractNumId w:val="19"/>
   </w:num>
-  <w:num w:numId="3" w16cid:durableId="869300735">
+  <w:num w:numId="7" w16cid:durableId="2077891357">
+    <w:abstractNumId w:val="2"/>
+  </w:num>
+  <w:num w:numId="8" w16cid:durableId="849414355">
+    <w:abstractNumId w:val="15"/>
+  </w:num>
+  <w:num w:numId="9" w16cid:durableId="1341198504">
+    <w:abstractNumId w:val="5"/>
+  </w:num>
+  <w:num w:numId="10" w16cid:durableId="1059134594">
     <w:abstractNumId w:val="11"/>
   </w:num>
-  <w:num w:numId="4" w16cid:durableId="659816737">
-    <w:abstractNumId w:val="0"/>
+  <w:num w:numId="11" w16cid:durableId="1221937138">
+    <w:abstractNumId w:val="14"/>
   </w:num>
-  <w:num w:numId="5" w16cid:durableId="1126462383">
+  <w:num w:numId="12" w16cid:durableId="7295156">
+    <w:abstractNumId w:val="13"/>
+  </w:num>
+  <w:num w:numId="13" w16cid:durableId="1537543361">
+    <w:abstractNumId w:val="18"/>
+  </w:num>
+  <w:num w:numId="14" w16cid:durableId="758991847">
+    <w:abstractNumId w:val="17"/>
+  </w:num>
+  <w:num w:numId="15" w16cid:durableId="1199006307">
     <w:abstractNumId w:val="9"/>
   </w:num>
-  <w:num w:numId="6" w16cid:durableId="42486870">
-    <w:abstractNumId w:val="18"/>
+  <w:num w:numId="16" w16cid:durableId="864438165">
+    <w:abstractNumId w:val="16"/>
   </w:num>
-  <w:num w:numId="7" w16cid:durableId="2077891357">
-    <w:abstractNumId w:val="1"/>
+  <w:num w:numId="17" w16cid:durableId="1630358547">
+    <w:abstractNumId w:val="7"/>
   </w:num>
-  <w:num w:numId="8" w16cid:durableId="849414355">
-    <w:abstractNumId w:val="14"/>
+  <w:num w:numId="18" w16cid:durableId="2101565035">
+    <w:abstractNumId w:val="6"/>
   </w:num>
-  <w:num w:numId="9" w16cid:durableId="1341198504">
+  <w:num w:numId="19" w16cid:durableId="301082878">
     <w:abstractNumId w:val="4"/>
   </w:num>
-  <w:num w:numId="10" w16cid:durableId="1059134594">
-    <w:abstractNumId w:val="10"/>
-  </w:num>
-  <w:num w:numId="11" w16cid:durableId="1221937138">
-    <w:abstractNumId w:val="13"/>
-  </w:num>
-  <w:num w:numId="12" w16cid:durableId="7295156">
-    <w:abstractNumId w:val="12"/>
-  </w:num>
-  <w:num w:numId="13" w16cid:durableId="1537543361">
-    <w:abstractNumId w:val="17"/>
-  </w:num>
-  <w:num w:numId="14" w16cid:durableId="758991847">
-    <w:abstractNumId w:val="16"/>
-  </w:num>
-  <w:num w:numId="15" w16cid:durableId="1199006307">
-    <w:abstractNumId w:val="8"/>
-  </w:num>
-  <w:num w:numId="16" w16cid:durableId="864438165">
-    <w:abstractNumId w:val="15"/>
-  </w:num>
-  <w:num w:numId="17" w16cid:durableId="1630358547">
-    <w:abstractNumId w:val="6"/>
-  </w:num>
-  <w:num w:numId="18" w16cid:durableId="2101565035">
-    <w:abstractNumId w:val="5"/>
-  </w:num>
-  <w:num w:numId="19" w16cid:durableId="301082878">
+  <w:num w:numId="20" w16cid:durableId="473639768">
     <w:abstractNumId w:val="3"/>
-  </w:num>
-  <w:num w:numId="20" w16cid:durableId="473639768">
-    <w:abstractNumId w:val="2"/>
     <w:lvlOverride w:ilvl="0">
       <w:startOverride w:val="1"/>
     </w:lvlOverride>
   </w:num>
   <w:num w:numId="21" w16cid:durableId="455834414">
-    <w:abstractNumId w:val="7"/>
+    <w:abstractNumId w:val="8"/>
+  </w:num>
+  <w:num w:numId="22" w16cid:durableId="1651442713">
+    <w:abstractNumId w:val="0"/>
   </w:num>
   <w:numIdMacAtCleanup w:val="16"/>
 </w:numbering>
@@ -6080,25 +6688,16 @@
 </file>
 
 <file path=customXml/item1.xml><?xml version="1.0" encoding="utf-8"?>
-<b:Sources xmlns:b="http://schemas.openxmlformats.org/officeDocument/2006/bibliography" xmlns="http://schemas.openxmlformats.org/officeDocument/2006/bibliography" SelectedStyle="\APASixthEditionOfficeOnline.xsl" StyleName="APA" Version="6"/>
-</file>
-
-<file path=customXml/item2.xml><?xml version="1.0" encoding="utf-8"?>
 <p:properties xmlns:p="http://schemas.microsoft.com/office/2006/metadata/properties" xmlns:xsi="http://www.w3.org/2001/XMLSchema-instance" xmlns:pc="http://schemas.microsoft.com/office/infopath/2007/PartnerControls">
   <documentManagement/>
 </p:properties>
 </file>
 
-<file path=customXml/item3.xml><?xml version="1.0" encoding="utf-8"?>
-<?mso-contentType ?>
-<FormTemplates xmlns="http://schemas.microsoft.com/sharepoint/v3/contenttype/forms">
-  <Display>DocumentLibraryForm</Display>
-  <Edit>DocumentLibraryForm</Edit>
-  <New>DocumentLibraryForm</New>
-</FormTemplates>
+<file path=customXml/item2.xml><?xml version="1.0" encoding="utf-8"?>
+<b:Sources xmlns:b="http://schemas.openxmlformats.org/officeDocument/2006/bibliography" xmlns="http://schemas.openxmlformats.org/officeDocument/2006/bibliography" SelectedStyle="\APASixthEditionOfficeOnline.xsl" StyleName="APA" Version="6"/>
 </file>
 
-<file path=customXml/item4.xml><?xml version="1.0" encoding="utf-8"?>
+<file path=customXml/item3.xml><?xml version="1.0" encoding="utf-8"?>
 <ct:contentTypeSchema xmlns:ct="http://schemas.microsoft.com/office/2006/metadata/contentType" xmlns:ma="http://schemas.microsoft.com/office/2006/metadata/properties/metaAttributes" ct:_="" ma:_="" ma:contentTypeName="Document" ma:contentTypeID="0x010100922A3CA1EE6E4B44833A16005451862E" ma:contentTypeVersion="3" ma:contentTypeDescription="Create a new document." ma:contentTypeScope="" ma:versionID="b712dade4bf8bf57d4a0cdac4d020ae4">
   <xsd:schema xmlns:xsd="http://www.w3.org/2001/XMLSchema" xmlns:xs="http://www.w3.org/2001/XMLSchema" xmlns:p="http://schemas.microsoft.com/office/2006/metadata/properties" xmlns:ns2="92f6da62-8f25-40d3-824c-47c5f6f94bd6" targetNamespace="http://schemas.microsoft.com/office/2006/metadata/properties" ma:root="true" ma:fieldsID="f6f8642a0533a95cbf7fc7bbc8c1e153" ns2:_="">
     <xsd:import namespace="92f6da62-8f25-40d3-824c-47c5f6f94bd6"/>
@@ -6236,15 +6835,16 @@
 </ct:contentTypeSchema>
 </file>
 
-<file path=customXml/itemProps1.xml><?xml version="1.0" encoding="utf-8"?>
-<ds:datastoreItem xmlns:ds="http://schemas.openxmlformats.org/officeDocument/2006/customXml" ds:itemID="{E3DA75CE-018A-4AF1-8B5C-BF0FBFE76924}">
-  <ds:schemaRefs>
-    <ds:schemaRef ds:uri="http://schemas.openxmlformats.org/officeDocument/2006/bibliography"/>
-  </ds:schemaRefs>
-</ds:datastoreItem>
+<file path=customXml/item4.xml><?xml version="1.0" encoding="utf-8"?>
+<?mso-contentType ?>
+<FormTemplates xmlns="http://schemas.microsoft.com/sharepoint/v3/contenttype/forms">
+  <Display>DocumentLibraryForm</Display>
+  <Edit>DocumentLibraryForm</Edit>
+  <New>DocumentLibraryForm</New>
+</FormTemplates>
 </file>
 
-<file path=customXml/itemProps2.xml><?xml version="1.0" encoding="utf-8"?>
+<file path=customXml/itemProps1.xml><?xml version="1.0" encoding="utf-8"?>
 <ds:datastoreItem xmlns:ds="http://schemas.openxmlformats.org/officeDocument/2006/customXml" ds:itemID="{B2E31085-3E06-4A9F-9730-20A04C85DF24}">
   <ds:schemaRefs>
     <ds:schemaRef ds:uri="http://schemas.microsoft.com/office/2006/metadata/properties"/>
@@ -6253,15 +6853,15 @@
 </ds:datastoreItem>
 </file>
 
-<file path=customXml/itemProps3.xml><?xml version="1.0" encoding="utf-8"?>
-<ds:datastoreItem xmlns:ds="http://schemas.openxmlformats.org/officeDocument/2006/customXml" ds:itemID="{82A9BB68-56B4-4822-B6B7-DB471576EB1F}">
+<file path=customXml/itemProps2.xml><?xml version="1.0" encoding="utf-8"?>
+<ds:datastoreItem xmlns:ds="http://schemas.openxmlformats.org/officeDocument/2006/customXml" ds:itemID="{E3DA75CE-018A-4AF1-8B5C-BF0FBFE76924}">
   <ds:schemaRefs>
-    <ds:schemaRef ds:uri="http://schemas.microsoft.com/sharepoint/v3/contenttype/forms"/>
+    <ds:schemaRef ds:uri="http://schemas.openxmlformats.org/officeDocument/2006/bibliography"/>
   </ds:schemaRefs>
 </ds:datastoreItem>
 </file>
 
-<file path=customXml/itemProps4.xml><?xml version="1.0" encoding="utf-8"?>
+<file path=customXml/itemProps3.xml><?xml version="1.0" encoding="utf-8"?>
 <ds:datastoreItem xmlns:ds="http://schemas.openxmlformats.org/officeDocument/2006/customXml" ds:itemID="{69960CE0-24F5-4ADF-A12F-FE193FFA9C43}">
   <ds:schemaRefs>
     <ds:schemaRef ds:uri="http://schemas.microsoft.com/office/2006/metadata/contentType"/>
@@ -6277,4 +6877,12 @@
     <ds:schemaRef ds:uri="http://schemas.microsoft.com/internal/obd"/>
   </ds:schemaRefs>
 </ds:datastoreItem>
+</file>
+
+<file path=customXml/itemProps4.xml><?xml version="1.0" encoding="utf-8"?>
+<ds:datastoreItem xmlns:ds="http://schemas.openxmlformats.org/officeDocument/2006/customXml" ds:itemID="{82A9BB68-56B4-4822-B6B7-DB471576EB1F}">
+  <ds:schemaRefs>
+    <ds:schemaRef ds:uri="http://schemas.microsoft.com/sharepoint/v3/contenttype/forms"/>
+  </ds:schemaRefs>
+</ds:datastoreItem>
 </file>
</xml_diff>

<commit_message>
Update report and presentation file
</commit_message>
<xml_diff>
--- a/documents/Assignment 3.docx
+++ b/documents/Assignment 3.docx
@@ -311,29 +311,7 @@
               <w:sz w:val="28"/>
               <w:szCs w:val="28"/>
             </w:rPr>
-            <w:t xml:space="preserve">Lecturer: Dr </w:t>
-          </w:r>
-          <w:proofErr w:type="spellStart"/>
-          <w:r>
-            <w:rPr>
-              <w:rFonts w:ascii="Times New Roman" w:hAnsi="Times New Roman"/>
-              <w:b/>
-              <w:bCs/>
-              <w:sz w:val="28"/>
-              <w:szCs w:val="28"/>
-            </w:rPr>
-            <w:t>Thuseethan</w:t>
-          </w:r>
-          <w:proofErr w:type="spellEnd"/>
-          <w:r>
-            <w:rPr>
-              <w:rFonts w:ascii="Times New Roman" w:hAnsi="Times New Roman"/>
-              <w:b/>
-              <w:bCs/>
-              <w:sz w:val="28"/>
-              <w:szCs w:val="28"/>
-            </w:rPr>
-            <w:t xml:space="preserve"> Selvarajah</w:t>
+            <w:t>Lecturer: Dr Thuseethan Selvarajah</w:t>
           </w:r>
         </w:p>
         <w:p>
@@ -388,23 +366,13 @@
             </w:rPr>
           </w:pPr>
           <w:bookmarkStart w:id="1" w:name="OLE_LINK2"/>
-          <w:proofErr w:type="spellStart"/>
           <w:r>
             <w:rPr>
               <w:rFonts w:ascii="Times New Roman" w:eastAsiaTheme="minorEastAsia" w:hAnsi="Times New Roman"/>
               <w:sz w:val="28"/>
               <w:szCs w:val="28"/>
             </w:rPr>
-            <w:t>Thi</w:t>
-          </w:r>
-          <w:proofErr w:type="spellEnd"/>
-          <w:r>
-            <w:rPr>
-              <w:rFonts w:ascii="Times New Roman" w:eastAsiaTheme="minorEastAsia" w:hAnsi="Times New Roman"/>
-              <w:sz w:val="28"/>
-              <w:szCs w:val="28"/>
-            </w:rPr>
-            <w:t xml:space="preserve"> Xuan Thanh Tran (Emma) - S389244</w:t>
+            <w:t>Thi Xuan Thanh Tran (Emma) - S389244</w:t>
           </w:r>
         </w:p>
         <w:bookmarkEnd w:id="1"/>
@@ -589,23 +557,13 @@
         </w:rPr>
         <w:t xml:space="preserve">Name: </w:t>
       </w:r>
-      <w:proofErr w:type="spellStart"/>
       <w:r>
         <w:rPr>
           <w:rFonts w:ascii="Times New Roman" w:eastAsiaTheme="minorEastAsia" w:hAnsi="Times New Roman"/>
           <w:sz w:val="24"/>
           <w:szCs w:val="24"/>
         </w:rPr>
-        <w:t>Thi</w:t>
-      </w:r>
-      <w:proofErr w:type="spellEnd"/>
-      <w:r>
-        <w:rPr>
-          <w:rFonts w:ascii="Times New Roman" w:eastAsiaTheme="minorEastAsia" w:hAnsi="Times New Roman"/>
-          <w:sz w:val="24"/>
-          <w:szCs w:val="24"/>
-        </w:rPr>
-        <w:t xml:space="preserve"> Xuan Thanh Tran (Emma)</w:t>
+        <w:t>Thi Xuan Thanh Tran (Emma)</w:t>
       </w:r>
     </w:p>
     <w:p>
@@ -687,27 +645,7 @@
           <w:szCs w:val="24"/>
           <w:lang w:val="en-AU"/>
         </w:rPr>
-        <w:t xml:space="preserve">My main responsibility in the team is the data processing stage. I cleaned, standardised and merged our three source datasets: NT crime statistics, regional population, and wholesale alcohol supply. This meant aligning everything to the same region-by-month level, handling the </w:t>
-      </w:r>
-      <w:proofErr w:type="spellStart"/>
-      <w:r>
-        <w:rPr>
-          <w:rFonts w:ascii="Times New Roman" w:eastAsia="Times New Roman" w:hAnsi="Times New Roman"/>
-          <w:sz w:val="24"/>
-          <w:szCs w:val="24"/>
-          <w:lang w:val="en-AU"/>
-        </w:rPr>
-        <w:t>SerPro</w:t>
-      </w:r>
-      <w:proofErr w:type="spellEnd"/>
-      <w:r>
-        <w:rPr>
-          <w:rFonts w:ascii="Times New Roman" w:eastAsia="Times New Roman" w:hAnsi="Times New Roman"/>
-          <w:sz w:val="24"/>
-          <w:szCs w:val="24"/>
-          <w:lang w:val="en-AU"/>
-        </w:rPr>
-        <w:t xml:space="preserve"> system change and the ANZSOC reclassification, and making sure the merged dataset was ready for modelling. I also took on the monitoring stage, which tracks how the model performs as new data comes in.</w:t>
+        <w:t>My main responsibility in the team is the data processing stage. I cleaned, standardised and merged our three source datasets: NT crime statistics, regional population, and wholesale alcohol supply. This meant aligning everything to the same region-by-month level, handling the SerPro system change and the ANZSOC reclassification, and making sure the merged dataset was ready for modelling. I also took on the monitoring stage, which tracks how the model performs as new data comes in.</w:t>
       </w:r>
     </w:p>
     <w:p>
@@ -803,27 +741,17 @@
         </w:rPr>
         <w:t xml:space="preserve"> </w:t>
       </w:r>
-      <w:r>
-        <w:fldChar w:fldCharType="begin"/>
-      </w:r>
-      <w:r>
-        <w:instrText>HYPERLINK "https://github.com/HendrickDang/PRT661-DATA-SCIENCE-PRACTICE/commits?author=EmmaTran56"</w:instrText>
-      </w:r>
-      <w:r>
-        <w:fldChar w:fldCharType="separate"/>
-      </w:r>
-      <w:r>
-        <w:rPr>
-          <w:rStyle w:val="Hyperlink"/>
-          <w:rFonts w:ascii="Times New Roman" w:eastAsia="Times New Roman" w:hAnsi="Times New Roman"/>
-          <w:sz w:val="24"/>
-          <w:szCs w:val="24"/>
-        </w:rPr>
-        <w:t>https://github.com/HendrickDang/PRT661-DATA-SCIENCE-PRACTICE/commits?author=EmmaTran56</w:t>
-      </w:r>
-      <w:r>
-        <w:fldChar w:fldCharType="end"/>
-      </w:r>
+      <w:hyperlink r:id="rId12" w:history="1">
+        <w:r>
+          <w:rPr>
+            <w:rStyle w:val="Hyperlink"/>
+            <w:rFonts w:ascii="Times New Roman" w:eastAsia="Times New Roman" w:hAnsi="Times New Roman"/>
+            <w:sz w:val="24"/>
+            <w:szCs w:val="24"/>
+          </w:rPr>
+          <w:t>https://github.com/HendrickDang/PRT661-DATA-SCIENCE-PRACTICE/commits?author=EmmaTran56</w:t>
+        </w:r>
+      </w:hyperlink>
     </w:p>
     <w:bookmarkEnd w:id="4"/>
     <w:p>
@@ -915,7 +843,7 @@
         </w:rPr>
         <w:t>Documentation:</w:t>
       </w:r>
-      <w:hyperlink r:id="rId12" w:history="1">
+      <w:hyperlink r:id="rId13" w:history="1">
         <w:r>
           <w:rPr>
             <w:rStyle w:val="Hyperlink"/>
@@ -961,7 +889,7 @@
         </w:rPr>
         <w:t>Code:</w:t>
       </w:r>
-      <w:hyperlink r:id="rId13" w:history="1">
+      <w:hyperlink r:id="rId14" w:history="1">
         <w:r>
           <w:rPr>
             <w:rStyle w:val="Hyperlink"/>
@@ -1215,25 +1143,7 @@
           <w:sz w:val="24"/>
           <w:szCs w:val="24"/>
         </w:rPr>
-        <w:t xml:space="preserve"> Lab: Storing and </w:t>
-      </w:r>
-      <w:proofErr w:type="spellStart"/>
-      <w:r>
-        <w:rPr>
-          <w:rFonts w:ascii="Times New Roman" w:eastAsia="Times New Roman" w:hAnsi="Times New Roman"/>
-          <w:sz w:val="24"/>
-          <w:szCs w:val="24"/>
-        </w:rPr>
-        <w:t>Analyzing</w:t>
-      </w:r>
-      <w:proofErr w:type="spellEnd"/>
-      <w:r>
-        <w:rPr>
-          <w:rFonts w:ascii="Times New Roman" w:eastAsia="Times New Roman" w:hAnsi="Times New Roman"/>
-          <w:sz w:val="24"/>
-          <w:szCs w:val="24"/>
-        </w:rPr>
-        <w:t xml:space="preserve"> Data by Using Amazon Redshift</w:t>
+        <w:t xml:space="preserve"> Lab: Storing and Analyzing Data by Using Amazon Redshift</w:t>
       </w:r>
     </w:p>
     <w:p>
@@ -1266,7 +1176,7 @@
                     <pic:cNvPicPr/>
                   </pic:nvPicPr>
                   <pic:blipFill>
-                    <a:blip r:embed="rId14"/>
+                    <a:blip r:embed="rId15"/>
                     <a:stretch>
                       <a:fillRect/>
                     </a:stretch>
@@ -1515,67 +1425,7 @@
           <w:szCs w:val="24"/>
           <w:lang w:val="en-AU"/>
         </w:rPr>
-        <w:t xml:space="preserve">My role in the team is analytics and machine learning. I own the modelling and the evaluation module, which compares Linear Regression, Ridge, Lasso and </w:t>
-      </w:r>
-      <w:proofErr w:type="spellStart"/>
-      <w:r>
-        <w:rPr>
-          <w:rFonts w:ascii="Times New Roman" w:eastAsia="Times New Roman" w:hAnsi="Times New Roman"/>
-          <w:sz w:val="24"/>
-          <w:szCs w:val="24"/>
-          <w:lang w:val="en-AU"/>
-        </w:rPr>
-        <w:t>XGBoost</w:t>
-      </w:r>
-      <w:proofErr w:type="spellEnd"/>
-      <w:r>
-        <w:rPr>
-          <w:rFonts w:ascii="Times New Roman" w:eastAsia="Times New Roman" w:hAnsi="Times New Roman"/>
-          <w:sz w:val="24"/>
-          <w:szCs w:val="24"/>
-          <w:lang w:val="en-AU"/>
-        </w:rPr>
-        <w:t xml:space="preserve"> against two simple baselines using a rolling-origin </w:t>
-      </w:r>
-      <w:proofErr w:type="spellStart"/>
-      <w:r>
-        <w:rPr>
-          <w:rFonts w:ascii="Times New Roman" w:eastAsia="Times New Roman" w:hAnsi="Times New Roman"/>
-          <w:sz w:val="24"/>
-          <w:szCs w:val="24"/>
-          <w:lang w:val="en-AU"/>
-        </w:rPr>
-        <w:t>backtest</w:t>
-      </w:r>
-      <w:proofErr w:type="spellEnd"/>
-      <w:r>
-        <w:rPr>
-          <w:rFonts w:ascii="Times New Roman" w:eastAsia="Times New Roman" w:hAnsi="Times New Roman"/>
-          <w:sz w:val="24"/>
-          <w:szCs w:val="24"/>
-          <w:lang w:val="en-AU"/>
-        </w:rPr>
-        <w:t xml:space="preserve">. The main result is a split recommendation: </w:t>
-      </w:r>
-      <w:proofErr w:type="spellStart"/>
-      <w:r>
-        <w:rPr>
-          <w:rFonts w:ascii="Times New Roman" w:eastAsia="Times New Roman" w:hAnsi="Times New Roman"/>
-          <w:sz w:val="24"/>
-          <w:szCs w:val="24"/>
-          <w:lang w:val="en-AU"/>
-        </w:rPr>
-        <w:t>XGBoost</w:t>
-      </w:r>
-      <w:proofErr w:type="spellEnd"/>
-      <w:r>
-        <w:rPr>
-          <w:rFonts w:ascii="Times New Roman" w:eastAsia="Times New Roman" w:hAnsi="Times New Roman"/>
-          <w:sz w:val="24"/>
-          <w:szCs w:val="24"/>
-          <w:lang w:val="en-AU"/>
-        </w:rPr>
-        <w:t xml:space="preserve"> for forecasts one month ahead (RMSE 90.7 per 100,000, about 30% better than seasonal naive) and a 12-month moving average from three months onward.</w:t>
+        <w:t>My role in the team is analytics and machine learning. I own the modelling and the evaluation module, which compares Linear Regression, Ridge, Lasso and XGBoost against two simple baselines using a rolling-origin backtest. The main result is a split recommendation: XGBoost for forecasts one month ahead (RMSE 90.7 per 100,000, about 30% better than seasonal naive) and a 12-month moving average from three months onward.</w:t>
       </w:r>
     </w:p>
     <w:p>
@@ -1599,27 +1449,7 @@
           <w:szCs w:val="24"/>
           <w:lang w:val="en-AU"/>
         </w:rPr>
-        <w:t xml:space="preserve">Since Assessment 2, I added the execution instructions, the model documentation and the workflow diagram to the repository, and updated the change log, README and requirements file so every reported figure can be regenerated. For Assessment 3, I prepared and presented slides 12 to 16: model performance, the </w:t>
-      </w:r>
-      <w:proofErr w:type="spellStart"/>
-      <w:r>
-        <w:rPr>
-          <w:rFonts w:ascii="Times New Roman" w:eastAsia="Times New Roman" w:hAnsi="Times New Roman"/>
-          <w:sz w:val="24"/>
-          <w:szCs w:val="24"/>
-          <w:lang w:val="en-AU"/>
-        </w:rPr>
-        <w:t>backtest</w:t>
-      </w:r>
-      <w:proofErr w:type="spellEnd"/>
-      <w:r>
-        <w:rPr>
-          <w:rFonts w:ascii="Times New Roman" w:eastAsia="Times New Roman" w:hAnsi="Times New Roman"/>
-          <w:sz w:val="24"/>
-          <w:szCs w:val="24"/>
-          <w:lang w:val="en-AU"/>
-        </w:rPr>
-        <w:t>, the alcohol supply comparison, technical challenges, and ethics. Before recording, I re-ran the pipeline and checked every figure against its output. This found out-of-date values in the alcohol model table, which I corrected, and wording errors on other slides, which I passed to the team. I also manage the group's GitHub repository and Jira site.</w:t>
+        <w:t>Since Assessment 2, I added the execution instructions, the model documentation and the workflow diagram to the repository, and updated the change log, README and requirements file so every reported figure can be regenerated. For Assessment 3, I prepared and presented slides 12 to 16: model performance, the backtest, the alcohol supply comparison, technical challenges, and ethics. Before recording, I re-ran the pipeline and checked every figure against its output. This found out-of-date values in the alcohol model table, which I corrected, and wording errors on other slides, which I passed to the team. I also manage the group's GitHub repository and Jira site.</w:t>
       </w:r>
     </w:p>
     <w:p>
@@ -1666,7 +1496,7 @@
         </w:rPr>
         <w:t xml:space="preserve">GitHub commits: </w:t>
       </w:r>
-      <w:hyperlink r:id="rId15" w:history="1">
+      <w:hyperlink r:id="rId16" w:history="1">
         <w:r>
           <w:rPr>
             <w:rStyle w:val="Hyperlink"/>
@@ -1694,7 +1524,7 @@
         </w:rPr>
         <w:t xml:space="preserve">Evaluation module: </w:t>
       </w:r>
-      <w:hyperlink r:id="rId16" w:history="1">
+      <w:hyperlink r:id="rId17" w:history="1">
         <w:r>
           <w:rPr>
             <w:rStyle w:val="Hyperlink"/>
@@ -1722,7 +1552,7 @@
         </w:rPr>
         <w:t xml:space="preserve">Backtest outputs: </w:t>
       </w:r>
-      <w:hyperlink r:id="rId17" w:history="1">
+      <w:hyperlink r:id="rId18" w:history="1">
         <w:r>
           <w:rPr>
             <w:rStyle w:val="Hyperlink"/>
@@ -1750,7 +1580,7 @@
         </w:rPr>
         <w:t xml:space="preserve">Presentation slides: </w:t>
       </w:r>
-      <w:hyperlink r:id="rId18" w:history="1">
+      <w:hyperlink r:id="rId19" w:history="1">
         <w:r>
           <w:rPr>
             <w:rStyle w:val="Hyperlink"/>
@@ -1778,7 +1608,7 @@
         </w:rPr>
         <w:t xml:space="preserve">Jira: </w:t>
       </w:r>
-      <w:hyperlink r:id="rId19" w:history="1">
+      <w:hyperlink r:id="rId20" w:history="1">
         <w:r>
           <w:rPr>
             <w:rStyle w:val="Hyperlink"/>
@@ -1855,47 +1685,25 @@
           <w:szCs w:val="24"/>
           <w:lang w:val="en-AU"/>
         </w:rPr>
-        <w:t xml:space="preserve">Before Assessment 4, I plan to save the tuned models with </w:t>
-      </w:r>
-      <w:proofErr w:type="spellStart"/>
-      <w:r>
-        <w:rPr>
-          <w:rFonts w:ascii="Times New Roman" w:eastAsia="Times New Roman" w:hAnsi="Times New Roman"/>
-          <w:sz w:val="24"/>
-          <w:szCs w:val="24"/>
-          <w:lang w:val="en-AU"/>
-        </w:rPr>
-        <w:t>joblib</w:t>
-      </w:r>
-      <w:proofErr w:type="spellEnd"/>
-      <w:r>
-        <w:rPr>
-          <w:rFonts w:ascii="Times New Roman" w:eastAsia="Times New Roman" w:hAnsi="Times New Roman"/>
-          <w:sz w:val="24"/>
-          <w:szCs w:val="24"/>
-          <w:lang w:val="en-AU"/>
-        </w:rPr>
-        <w:t xml:space="preserve"> so the dashboard can load them without re-running the pipeline, and to work with Thomas to show the </w:t>
-      </w:r>
-      <w:proofErr w:type="spellStart"/>
-      <w:r>
-        <w:rPr>
-          <w:rFonts w:ascii="Times New Roman" w:eastAsia="Times New Roman" w:hAnsi="Times New Roman"/>
-          <w:sz w:val="24"/>
-          <w:szCs w:val="24"/>
-          <w:lang w:val="en-AU"/>
-        </w:rPr>
-        <w:t>backtest</w:t>
-      </w:r>
-      <w:proofErr w:type="spellEnd"/>
-      <w:r>
-        <w:rPr>
-          <w:rFonts w:ascii="Times New Roman" w:eastAsia="Times New Roman" w:hAnsi="Times New Roman"/>
-          <w:sz w:val="24"/>
-          <w:szCs w:val="24"/>
-          <w:lang w:val="en-AU"/>
-        </w:rPr>
-        <w:t xml:space="preserve"> forecasts and prediction intervals in the dashboard. I will also re-check the single-split results with the provisional months excluded, finalise the drift thresholds with Emma for the monitoring stage, and write the modelling and evaluation sections of the final report.</w:t>
+        <w:t xml:space="preserve">Before Assessment 4, I plan to save the tuned models with joblib so the dashboard can load them without re-running the pipeline, and to work with Thomas to show the backtest forecasts and prediction intervals in the dashboard. </w:t>
+      </w:r>
+      <w:r>
+        <w:rPr>
+          <w:rFonts w:ascii="Times New Roman" w:eastAsia="Times New Roman" w:hAnsi="Times New Roman"/>
+          <w:sz w:val="24"/>
+          <w:szCs w:val="24"/>
+          <w:lang w:val="en-AU"/>
+        </w:rPr>
+        <w:t>I will also lag the two same-month features found in Will's audit, re-check the single-split results with the provisional months excluded,</w:t>
+      </w:r>
+      <w:r>
+        <w:rPr>
+          <w:rFonts w:ascii="Times New Roman" w:eastAsia="Times New Roman" w:hAnsi="Times New Roman"/>
+          <w:sz w:val="24"/>
+          <w:szCs w:val="24"/>
+          <w:lang w:val="en-AU"/>
+        </w:rPr>
+        <w:t>, finalise the drift thresholds with Emma for the monitoring stage, and write the modelling and evaluation sections of the final report.</w:t>
       </w:r>
     </w:p>
     <w:p>
@@ -1953,27 +1761,7 @@
           <w:szCs w:val="24"/>
           <w:lang w:val="en-AU"/>
         </w:rPr>
-        <w:t xml:space="preserve">Lab 2 (Week 4 materials) - Module 8: Storing and Organizing Data - Lab: Storing and </w:t>
-      </w:r>
-      <w:proofErr w:type="spellStart"/>
-      <w:r>
-        <w:rPr>
-          <w:rFonts w:ascii="Times New Roman" w:eastAsia="Times New Roman" w:hAnsi="Times New Roman"/>
-          <w:sz w:val="24"/>
-          <w:szCs w:val="24"/>
-          <w:lang w:val="en-AU"/>
-        </w:rPr>
-        <w:t>Analyzing</w:t>
-      </w:r>
-      <w:proofErr w:type="spellEnd"/>
-      <w:r>
-        <w:rPr>
-          <w:rFonts w:ascii="Times New Roman" w:eastAsia="Times New Roman" w:hAnsi="Times New Roman"/>
-          <w:sz w:val="24"/>
-          <w:szCs w:val="24"/>
-          <w:lang w:val="en-AU"/>
-        </w:rPr>
-        <w:t xml:space="preserve"> Data by Using Amazon Redshift</w:t>
+        <w:t>Lab 2 (Week 4 materials) - Module 8: Storing and Organizing Data - Lab: Storing and Analyzing Data by Using Amazon Redshift</w:t>
       </w:r>
     </w:p>
     <w:p>
@@ -2010,7 +1798,7 @@
                     <pic:cNvPicPr/>
                   </pic:nvPicPr>
                   <pic:blipFill>
-                    <a:blip r:embed="rId20" cstate="print">
+                    <a:blip r:embed="rId21" cstate="print">
                       <a:extLst>
                         <a:ext uri="{28A0092B-C50C-407E-A947-70E740481C1C}">
                           <a14:useLocalDpi xmlns:a14="http://schemas.microsoft.com/office/drawing/2010/main" val="0"/>
@@ -2110,27 +1898,25 @@
           <w:szCs w:val="24"/>
           <w:lang w:val="en-AU"/>
         </w:rPr>
-        <w:t xml:space="preserve">We do not use Redshift in our project, but I applied these ideas to the modelling work. Testing as a different user is the same idea as checking that our results reproduce on another machine: when a teammate got a different </w:t>
-      </w:r>
-      <w:proofErr w:type="spellStart"/>
-      <w:r>
-        <w:rPr>
-          <w:rFonts w:ascii="Times New Roman" w:eastAsia="Times New Roman" w:hAnsi="Times New Roman"/>
-          <w:sz w:val="24"/>
-          <w:szCs w:val="24"/>
-          <w:lang w:val="en-AU"/>
-        </w:rPr>
-        <w:t>XGBoost</w:t>
-      </w:r>
-      <w:proofErr w:type="spellEnd"/>
-      <w:r>
-        <w:rPr>
-          <w:rFonts w:ascii="Times New Roman" w:eastAsia="Times New Roman" w:hAnsi="Times New Roman"/>
-          <w:sz w:val="24"/>
-          <w:szCs w:val="24"/>
-          <w:lang w:val="en-AU"/>
-        </w:rPr>
-        <w:t xml:space="preserve"> error from mine, I pinned the package versions so both machines agree. Querying through the CLI instead of the console also matches how I built the evaluation module, which writes its results to CSV files, so the report and slides are checked against those files and not copied by hand. Finally, the lab made our cloud plan for PFES more concrete: IAM roles and a security group are what would control who can query the data.</w:t>
+        <w:t xml:space="preserve">We do not use Redshift in our project, but I applied these ideas to the modelling work. Testing as a different user is the same idea as checking that our results reproduce on another machine: when a teammate got a different XGBoost error from mine, </w:t>
+      </w:r>
+      <w:r>
+        <w:rPr>
+          <w:rFonts w:ascii="Times New Roman" w:eastAsia="Times New Roman" w:hAnsi="Times New Roman"/>
+          <w:sz w:val="24"/>
+          <w:szCs w:val="24"/>
+          <w:lang w:val="en-AU"/>
+        </w:rPr>
+        <w:t>when a teammate got a different XGBoost error from mine, I pinned the package versions. The linear models now match exactly, and the small XGBoost difference that remains is documented as a platform effect</w:t>
+      </w:r>
+      <w:r>
+        <w:rPr>
+          <w:rFonts w:ascii="Times New Roman" w:eastAsia="Times New Roman" w:hAnsi="Times New Roman"/>
+          <w:sz w:val="24"/>
+          <w:szCs w:val="24"/>
+          <w:lang w:val="en-AU"/>
+        </w:rPr>
+        <w:t>. Querying through the CLI instead of the console also matches how I built the evaluation module, which writes its results to CSV files, so the report and slides are checked against those files and not copied by hand. Finally, the lab made our cloud plan for PFES more concrete: IAM roles and a security group are what would control who can query the data.</w:t>
       </w:r>
     </w:p>
     <w:p>
@@ -2277,15 +2063,7 @@
         <w:pStyle w:val="NormalWeb"/>
       </w:pPr>
       <w:r>
-        <w:t xml:space="preserve">My role is data engineering. I own the ingest and storage stages that every later stage depends on: the ingest stage loads the six source files, runs structural checks and logs each run in </w:t>
-      </w:r>
-      <w:proofErr w:type="spellStart"/>
-      <w:r>
-        <w:t>manifest.json</w:t>
-      </w:r>
-      <w:proofErr w:type="spellEnd"/>
-      <w:r>
-        <w:t>, while the source → raw → processed layout keeps the original downloads untouched.</w:t>
+        <w:t>My role is data engineering. I own the ingest and storage stages that every later stage depends on: the ingest stage loads the six source files, runs structural checks and logs each run in manifest.json, while the source → raw → processed layout keeps the original downloads untouched.</w:t>
       </w:r>
     </w:p>
     <w:p>
@@ -2293,15 +2071,7 @@
         <w:pStyle w:val="NormalWeb"/>
       </w:pPr>
       <w:r>
-        <w:t xml:space="preserve">Since Assessment 2, I built a read-only data lineage and reproducibility audit (pull request #8). It traces every row count from 55,146 raw crime rows to the 696-row model panel (504 train, 192 test), showing that our slides misstate the record count and that training actually starts in 2016, not 2015. A clean-clone rerun with pinned versions reproduced the linear models exactly; </w:t>
-      </w:r>
-      <w:proofErr w:type="spellStart"/>
-      <w:r>
-        <w:t>XGBoost</w:t>
-      </w:r>
-      <w:proofErr w:type="spellEnd"/>
-      <w:r>
-        <w:t xml:space="preserve"> gave 80.7 instead of 84.5 RMSE per 100k on another platform, but our conclusions hold. </w:t>
+        <w:t xml:space="preserve">Since Assessment 2, I built a read-only data lineage and reproducibility audit (pull request #8). It traces every row count from 55,146 raw crime rows to the 696-row model panel (504 train, 192 test), showing that our slides misstate the record count and that training actually starts in 2016, not 2015. A clean-clone rerun with pinned versions reproduced the linear models exactly; XGBoost gave 80.7 instead of 84.5 RMSE per 100k on another platform, but our conclusions hold. </w:t>
       </w:r>
     </w:p>
     <w:p>
@@ -2309,31 +2079,7 @@
         <w:pStyle w:val="NormalWeb"/>
       </w:pPr>
       <w:r>
-        <w:t xml:space="preserve">Most importantly, it found that </w:t>
-      </w:r>
-      <w:proofErr w:type="spellStart"/>
-      <w:r>
-        <w:t>Alcohol_offences</w:t>
-      </w:r>
-      <w:proofErr w:type="spellEnd"/>
-      <w:r>
-        <w:t xml:space="preserve"> and </w:t>
-      </w:r>
-      <w:proofErr w:type="spellStart"/>
-      <w:r>
-        <w:t>DV_offences</w:t>
-      </w:r>
-      <w:proofErr w:type="spellEnd"/>
-      <w:r>
-        <w:t xml:space="preserve"> are counted from the same month as the target (49% and 64% of target offences, correlation up to 0.97). This is a leakage risk for the single-split results but not for the rolling-origin </w:t>
-      </w:r>
-      <w:proofErr w:type="spellStart"/>
-      <w:r>
-        <w:t>backtest</w:t>
-      </w:r>
-      <w:proofErr w:type="spellEnd"/>
-      <w:r>
-        <w:t>, and I documented it with a suggested fix. For Assessment 3, I also prepared the first draft of the slide deck and present slides 1 to 6.</w:t>
+        <w:t>Most importantly, it found that Alcohol_offences and DV_offences are counted from the same month as the target (49% and 64% of target offences, correlation up to 0.97). This is a leakage risk for the single-split results but not for the rolling-origin backtest, and I documented it with a suggested fix. For Assessment 3, I also prepared the first draft of the slide deck and present slides 1 to 6.</w:t>
       </w:r>
     </w:p>
     <w:p>
@@ -2378,7 +2124,7 @@
         </w:rPr>
         <w:t xml:space="preserve">GitHub commits: </w:t>
       </w:r>
-      <w:hyperlink r:id="rId21" w:history="1">
+      <w:hyperlink r:id="rId22" w:history="1">
         <w:r>
           <w:rPr>
             <w:rStyle w:val="Hyperlink"/>
@@ -2405,7 +2151,7 @@
         </w:rPr>
         <w:t xml:space="preserve">Data audit (pull request #8): </w:t>
       </w:r>
-      <w:hyperlink r:id="rId22" w:history="1">
+      <w:hyperlink r:id="rId23" w:history="1">
         <w:r>
           <w:rPr>
             <w:rStyle w:val="Hyperlink"/>
@@ -2432,7 +2178,7 @@
         </w:rPr>
         <w:t xml:space="preserve">Audit report: </w:t>
       </w:r>
-      <w:hyperlink r:id="rId23" w:history="1">
+      <w:hyperlink r:id="rId24" w:history="1">
         <w:r>
           <w:rPr>
             <w:rStyle w:val="Hyperlink"/>
@@ -2459,7 +2205,7 @@
         </w:rPr>
         <w:t xml:space="preserve">Ingest stage: </w:t>
       </w:r>
-      <w:hyperlink r:id="rId24" w:history="1">
+      <w:hyperlink r:id="rId25" w:history="1">
         <w:r>
           <w:rPr>
             <w:rStyle w:val="Hyperlink"/>
@@ -2626,27 +2372,7 @@
           <w:szCs w:val="24"/>
           <w:lang w:val="en-AU"/>
         </w:rPr>
-        <w:t xml:space="preserve">Laboratory 4 - Module 8 Lab: Storing and </w:t>
-      </w:r>
-      <w:proofErr w:type="spellStart"/>
-      <w:r>
-        <w:rPr>
-          <w:rFonts w:ascii="Times New Roman" w:eastAsia="Times New Roman" w:hAnsi="Times New Roman"/>
-          <w:sz w:val="24"/>
-          <w:szCs w:val="24"/>
-          <w:lang w:val="en-AU"/>
-        </w:rPr>
-        <w:t>Analyzing</w:t>
-      </w:r>
-      <w:proofErr w:type="spellEnd"/>
-      <w:r>
-        <w:rPr>
-          <w:rFonts w:ascii="Times New Roman" w:eastAsia="Times New Roman" w:hAnsi="Times New Roman"/>
-          <w:sz w:val="24"/>
-          <w:szCs w:val="24"/>
-          <w:lang w:val="en-AU"/>
-        </w:rPr>
-        <w:t xml:space="preserve"> Data by Using Amazon Redshift</w:t>
+        <w:t>Laboratory 4 - Module 8 Lab: Storing and Analyzing Data by Using Amazon Redshift</w:t>
       </w:r>
     </w:p>
     <w:p>
@@ -2670,7 +2396,7 @@
         </w:rPr>
         <w:lastRenderedPageBreak/>
         <w:drawing>
-          <wp:inline distT="0" distB="0" distL="0" distR="0" wp14:anchorId="7A07F2FB" wp14:editId="28EC1AB4">
+          <wp:inline distT="0" distB="0" distL="0" distR="0" wp14:anchorId="7A07F2FB" wp14:editId="19FC46F9">
             <wp:extent cx="5746290" cy="3232846"/>
             <wp:effectExtent l="0" t="0" r="6985" b="5715"/>
             <wp:docPr id="1286285774" name="Picture 2"/>
@@ -2687,7 +2413,7 @@
                     </pic:cNvPicPr>
                   </pic:nvPicPr>
                   <pic:blipFill>
-                    <a:blip r:embed="rId25" cstate="print">
+                    <a:blip r:embed="rId26" cstate="print">
                       <a:extLst>
                         <a:ext uri="{28A0092B-C50C-407E-A947-70E740481C1C}">
                           <a14:useLocalDpi xmlns:a14="http://schemas.microsoft.com/office/drawing/2010/main" val="0"/>
@@ -2847,43 +2573,7 @@
           <w:sz w:val="24"/>
           <w:szCs w:val="24"/>
         </w:rPr>
-        <w:t xml:space="preserve">For this project I built the interactive </w:t>
-      </w:r>
-      <w:proofErr w:type="spellStart"/>
-      <w:r>
-        <w:rPr>
-          <w:rFonts w:ascii="Times New Roman" w:eastAsia="Times New Roman" w:hAnsi="Times New Roman"/>
-          <w:sz w:val="24"/>
-          <w:szCs w:val="24"/>
-        </w:rPr>
-        <w:t>Streamlit</w:t>
-      </w:r>
-      <w:proofErr w:type="spellEnd"/>
-      <w:r>
-        <w:rPr>
-          <w:rFonts w:ascii="Times New Roman" w:eastAsia="Times New Roman" w:hAnsi="Times New Roman"/>
-          <w:sz w:val="24"/>
-          <w:szCs w:val="24"/>
-        </w:rPr>
-        <w:t xml:space="preserve"> decision-support dashboard and co-developed the machine-learning forecasting layer that powers it. On the dashboard side, I created the dual-role portal — a non-technical Administrator Portal for policy makers and police (KPI briefing, an interactive </w:t>
-      </w:r>
-      <w:proofErr w:type="spellStart"/>
-      <w:r>
-        <w:rPr>
-          <w:rFonts w:ascii="Times New Roman" w:eastAsia="Times New Roman" w:hAnsi="Times New Roman"/>
-          <w:sz w:val="24"/>
-          <w:szCs w:val="24"/>
-        </w:rPr>
-        <w:t>Plotly</w:t>
-      </w:r>
-      <w:proofErr w:type="spellEnd"/>
-      <w:r>
-        <w:rPr>
-          <w:rFonts w:ascii="Times New Roman" w:eastAsia="Times New Roman" w:hAnsi="Times New Roman"/>
-          <w:sz w:val="24"/>
-          <w:szCs w:val="24"/>
-        </w:rPr>
-        <w:t xml:space="preserve"> spatial crime map, a staffing priority matrix, a seasonal surge calendar, a policy intervention simulator, and briefing export) and a technical Data Science Workbench for reviewers (EDA, PCA, feature selection/VIF, hyperparameter curves, Model A vs B, and residual diagnostics) — together with the shared core_data.py caching and training module and a Windows launcher. On the machine-learning side, I co-developed the forecasting suite, building leakage-free feature variants V1–V4 with time-series cross-validation, performing </w:t>
+        <w:t xml:space="preserve">For this project I built the interactive Streamlit decision-support dashboard and co-developed the machine-learning forecasting layer that powers it. On the dashboard side, I created the dual-role portal — a non-technical Administrator Portal for policy makers and police (KPI briefing, an interactive Plotly spatial crime map, a staffing priority matrix, a seasonal surge calendar, a policy intervention simulator, and briefing export) and a technical Data Science Workbench for reviewers (EDA, PCA, feature selection/VIF, hyperparameter curves, Model A vs B, and residual diagnostics) — together with the shared core_data.py caching and training module and a Windows launcher. On the machine-learning side, I co-developed the forecasting suite, building leakage-free feature variants V1–V4 with time-series cross-validation, performing </w:t>
       </w:r>
       <w:r>
         <w:rPr>
@@ -2892,25 +2582,7 @@
           <w:szCs w:val="24"/>
         </w:rPr>
         <w:lastRenderedPageBreak/>
-        <w:t xml:space="preserve">backward-elimination and VIF feature selection, tuning Ridge, Lasso and </w:t>
-      </w:r>
-      <w:proofErr w:type="spellStart"/>
-      <w:r>
-        <w:rPr>
-          <w:rFonts w:ascii="Times New Roman" w:eastAsia="Times New Roman" w:hAnsi="Times New Roman"/>
-          <w:sz w:val="24"/>
-          <w:szCs w:val="24"/>
-        </w:rPr>
-        <w:t>XGBoost</w:t>
-      </w:r>
-      <w:proofErr w:type="spellEnd"/>
-      <w:r>
-        <w:rPr>
-          <w:rFonts w:ascii="Times New Roman" w:eastAsia="Times New Roman" w:hAnsi="Times New Roman"/>
-          <w:sz w:val="24"/>
-          <w:szCs w:val="24"/>
-        </w:rPr>
-        <w:t>, and wiring the trained model into the dashboard's simulator so it produces live predictions from user-adjusted inputs.</w:t>
+        <w:t>backward-elimination and VIF feature selection, tuning Ridge, Lasso and XGBoost, and wiring the trained model into the dashboard's simulator so it produces live predictions from user-adjusted inputs.</w:t>
       </w:r>
     </w:p>
     <w:p>
@@ -2945,25 +2617,7 @@
           <w:sz w:val="24"/>
           <w:szCs w:val="24"/>
         </w:rPr>
-        <w:t xml:space="preserve"> I built the interactive </w:t>
-      </w:r>
-      <w:proofErr w:type="spellStart"/>
-      <w:r>
-        <w:rPr>
-          <w:rFonts w:ascii="Times New Roman" w:eastAsia="Times New Roman" w:hAnsi="Times New Roman"/>
-          <w:sz w:val="24"/>
-          <w:szCs w:val="24"/>
-        </w:rPr>
-        <w:t>Streamlit</w:t>
-      </w:r>
-      <w:proofErr w:type="spellEnd"/>
-      <w:r>
-        <w:rPr>
-          <w:rFonts w:ascii="Times New Roman" w:eastAsia="Times New Roman" w:hAnsi="Times New Roman"/>
-          <w:sz w:val="24"/>
-          <w:szCs w:val="24"/>
-        </w:rPr>
-        <w:t xml:space="preserve"> decision-support dashboard and co-developed the machine-learning forecasting layer that powers it. On the dashboard side, I created the dual-role portal </w:t>
+        <w:t xml:space="preserve"> I built the interactive Streamlit decision-support dashboard and co-developed the machine-learning forecasting layer that powers it. On the dashboard side, I created the dual-role portal </w:t>
       </w:r>
       <w:r>
         <w:rPr>
@@ -2979,43 +2633,7 @@
           <w:sz w:val="24"/>
           <w:szCs w:val="24"/>
         </w:rPr>
-        <w:t xml:space="preserve">a non-technical Administrator Portal for policy makers and police (KPI briefing, an interactive </w:t>
-      </w:r>
-      <w:proofErr w:type="spellStart"/>
-      <w:r>
-        <w:rPr>
-          <w:rFonts w:ascii="Times New Roman" w:eastAsia="Times New Roman" w:hAnsi="Times New Roman"/>
-          <w:sz w:val="24"/>
-          <w:szCs w:val="24"/>
-        </w:rPr>
-        <w:t>Plotly</w:t>
-      </w:r>
-      <w:proofErr w:type="spellEnd"/>
-      <w:r>
-        <w:rPr>
-          <w:rFonts w:ascii="Times New Roman" w:eastAsia="Times New Roman" w:hAnsi="Times New Roman"/>
-          <w:sz w:val="24"/>
-          <w:szCs w:val="24"/>
-        </w:rPr>
-        <w:t xml:space="preserve"> spatial crime map, a staffing priority matrix, a seasonal surge calendar, a policy intervention simulator, and briefing export) and a technical Data Science Workbench for reviewers (EDA, PCA, feature selection/VIF, hyperparameter curves, Model A vs B, and residual diagnostics) r. On the machine-learning side, I co-developed the forecasting suite, building leakage-free feature variants V1–V4 with time-series cross-validation, performing backward-elimination and VIF feature selection, tuning Ridge, Lasso and </w:t>
-      </w:r>
-      <w:proofErr w:type="spellStart"/>
-      <w:r>
-        <w:rPr>
-          <w:rFonts w:ascii="Times New Roman" w:eastAsia="Times New Roman" w:hAnsi="Times New Roman"/>
-          <w:sz w:val="24"/>
-          <w:szCs w:val="24"/>
-        </w:rPr>
-        <w:t>XGBoost</w:t>
-      </w:r>
-      <w:proofErr w:type="spellEnd"/>
-      <w:r>
-        <w:rPr>
-          <w:rFonts w:ascii="Times New Roman" w:eastAsia="Times New Roman" w:hAnsi="Times New Roman"/>
-          <w:sz w:val="24"/>
-          <w:szCs w:val="24"/>
-        </w:rPr>
-        <w:t>, and wiring the trained model into the dashboard's simulator so it produces live predictions from user-adjusted inputs.</w:t>
+        <w:t>a non-technical Administrator Portal for policy makers and police (KPI briefing, an interactive Plotly spatial crime map, a staffing priority matrix, a seasonal surge calendar, a policy intervention simulator, and briefing export) and a technical Data Science Workbench for reviewers (EDA, PCA, feature selection/VIF, hyperparameter curves, Model A vs B, and residual diagnostics) r. On the machine-learning side, I co-developed the forecasting suite, building leakage-free feature variants V1–V4 with time-series cross-validation, performing backward-elimination and VIF feature selection, tuning Ridge, Lasso and XGBoost, and wiring the trained model into the dashboard's simulator so it produces live predictions from user-adjusted inputs.</w:t>
       </w:r>
     </w:p>
     <w:p>
@@ -3117,61 +2735,7 @@
           <w:sz w:val="24"/>
           <w:szCs w:val="24"/>
         </w:rPr>
-        <w:t>For Assessment 4 I plan to improve the dashboard from a local prototype into a complete, deployed forecasting tool for PFES: I will add a multi-horizon forecast view (1/3/6/12 months) with prediction intervals and an automatic split-specification switcher (</w:t>
-      </w:r>
-      <w:proofErr w:type="spellStart"/>
-      <w:r>
-        <w:rPr>
-          <w:rFonts w:ascii="Times New Roman" w:eastAsia="Times New Roman" w:hAnsi="Times New Roman"/>
-          <w:sz w:val="24"/>
-          <w:szCs w:val="24"/>
-        </w:rPr>
-        <w:t>XGBoost</w:t>
-      </w:r>
-      <w:proofErr w:type="spellEnd"/>
-      <w:r>
-        <w:rPr>
-          <w:rFonts w:ascii="Times New Roman" w:eastAsia="Times New Roman" w:hAnsi="Times New Roman"/>
-          <w:sz w:val="24"/>
-          <w:szCs w:val="24"/>
-        </w:rPr>
-        <w:t xml:space="preserve"> at one month, moving average beyond), load serialised </w:t>
-      </w:r>
-      <w:proofErr w:type="spellStart"/>
-      <w:r>
-        <w:rPr>
-          <w:rFonts w:ascii="Times New Roman" w:eastAsia="Times New Roman" w:hAnsi="Times New Roman"/>
-          <w:sz w:val="24"/>
-          <w:szCs w:val="24"/>
-        </w:rPr>
-        <w:t>joblib</w:t>
-      </w:r>
-      <w:proofErr w:type="spellEnd"/>
-      <w:r>
-        <w:rPr>
-          <w:rFonts w:ascii="Times New Roman" w:eastAsia="Times New Roman" w:hAnsi="Times New Roman"/>
-          <w:sz w:val="24"/>
-          <w:szCs w:val="24"/>
-        </w:rPr>
-        <w:t xml:space="preserve"> models so the dashboard matches the report exactly rather than retraining, deploy the app to </w:t>
-      </w:r>
-      <w:proofErr w:type="spellStart"/>
-      <w:r>
-        <w:rPr>
-          <w:rFonts w:ascii="Times New Roman" w:eastAsia="Times New Roman" w:hAnsi="Times New Roman"/>
-          <w:sz w:val="24"/>
-          <w:szCs w:val="24"/>
-        </w:rPr>
-        <w:t>Streamlit</w:t>
-      </w:r>
-      <w:proofErr w:type="spellEnd"/>
-      <w:r>
-        <w:rPr>
-          <w:rFonts w:ascii="Times New Roman" w:eastAsia="Times New Roman" w:hAnsi="Times New Roman"/>
-          <w:sz w:val="24"/>
-          <w:szCs w:val="24"/>
-        </w:rPr>
-        <w:t xml:space="preserve"> Community Cloud (fixing the cross-platform Outputs/ path case bug), and align the features with the corrected lagged alcohol/DV model, plus annotate structural breaks and provisional months in the UI — with only the model-serialisation and feature-alignment items depending on the modelling owner, while the rest I can complete independently.</w:t>
+        <w:t>For Assessment 4 I plan to improve the dashboard from a local prototype into a complete, deployed forecasting tool for PFES: I will add a multi-horizon forecast view (1/3/6/12 months) with prediction intervals and an automatic split-specification switcher (XGBoost at one month, moving average beyond), load serialised joblib models so the dashboard matches the report exactly rather than retraining, deploy the app to Streamlit Community Cloud (fixing the cross-platform Outputs/ path case bug), and align the features with the corrected lagged alcohol/DV model, plus annotate structural breaks and provisional months in the UI — with only the model-serialisation and feature-alignment items depending on the modelling owner, while the rest I can complete independently.</w:t>
       </w:r>
     </w:p>
     <w:p>
@@ -3211,69 +2775,15 @@
         </w:rPr>
         <w:t xml:space="preserve">GitHub repository: </w:t>
       </w:r>
-      <w:r>
-        <w:rPr>
-          <w:lang w:val="en-AU"/>
-        </w:rPr>
-        <w:fldChar w:fldCharType="begin"/>
-      </w:r>
-      <w:r>
-        <w:rPr>
-          <w:lang w:val="en-AU"/>
-        </w:rPr>
-        <w:instrText>HYPERLINK "https://github.com/HendrickDang/PRT661-DATA-SCIENCE-PRACTICE/commits?author=thomastran2k2"</w:instrText>
-      </w:r>
-      <w:r>
-        <w:rPr>
-          <w:lang w:val="en-AU"/>
-        </w:rPr>
-      </w:r>
-      <w:r>
-        <w:rPr>
-          <w:lang w:val="en-AU"/>
-        </w:rPr>
-        <w:fldChar w:fldCharType="separate"/>
-      </w:r>
-      <w:r>
-        <w:rPr>
-          <w:rStyle w:val="Hyperlink"/>
-          <w:lang w:val="en-AU"/>
-        </w:rPr>
-        <w:t xml:space="preserve">Commits · </w:t>
-      </w:r>
-      <w:proofErr w:type="spellStart"/>
-      <w:r>
-        <w:rPr>
-          <w:rStyle w:val="Hyperlink"/>
-          <w:lang w:val="en-AU"/>
-        </w:rPr>
-        <w:t>HendrickDang</w:t>
-      </w:r>
-      <w:proofErr w:type="spellEnd"/>
-      <w:r>
-        <w:rPr>
-          <w:rStyle w:val="Hyperlink"/>
-          <w:lang w:val="en-AU"/>
-        </w:rPr>
-        <w:t>/PRT661</w:t>
-      </w:r>
-      <w:r>
-        <w:rPr>
-          <w:rStyle w:val="Hyperlink"/>
-          <w:lang w:val="en-AU"/>
-        </w:rPr>
-        <w:t>-</w:t>
-      </w:r>
-      <w:r>
-        <w:rPr>
-          <w:rStyle w:val="Hyperlink"/>
-          <w:lang w:val="en-AU"/>
-        </w:rPr>
-        <w:t>DATA-SCIENCE-PRACTICE</w:t>
-      </w:r>
-      <w:r>
-        <w:fldChar w:fldCharType="end"/>
-      </w:r>
+      <w:hyperlink r:id="rId27" w:history="1">
+        <w:r>
+          <w:rPr>
+            <w:rStyle w:val="Hyperlink"/>
+            <w:lang w:val="en-AU"/>
+          </w:rPr>
+          <w:t>Commits · HendrickDang/PRT661-DATA-SCIENCE-PRACTICE</w:t>
+        </w:r>
+      </w:hyperlink>
     </w:p>
     <w:p>
       <w:pPr>
@@ -3298,7 +2808,7 @@
         </w:rPr>
         <w:t>Documentation:</w:t>
       </w:r>
-      <w:hyperlink r:id="rId26" w:history="1">
+      <w:hyperlink r:id="rId28" w:history="1">
         <w:r>
           <w:rPr>
             <w:rStyle w:val="Hyperlink"/>
@@ -3338,7 +2848,7 @@
         </w:rPr>
         <w:t>Code:</w:t>
       </w:r>
-      <w:hyperlink r:id="rId27" w:history="1">
+      <w:hyperlink r:id="rId29" w:history="1">
         <w:r>
           <w:rPr>
             <w:rStyle w:val="Hyperlink"/>
@@ -3346,27 +2856,7 @@
             <w:sz w:val="24"/>
             <w:szCs w:val="24"/>
           </w:rPr>
-          <w:t xml:space="preserve">PRT661-DATA-SCIENCE-PRACTICE/app.py at main · </w:t>
-        </w:r>
-        <w:proofErr w:type="spellStart"/>
-        <w:r>
-          <w:rPr>
-            <w:rStyle w:val="Hyperlink"/>
-            <w:rFonts w:ascii="Times New Roman" w:eastAsia="Times New Roman" w:hAnsi="Times New Roman"/>
-            <w:sz w:val="24"/>
-            <w:szCs w:val="24"/>
-          </w:rPr>
-          <w:t>HendrickDang</w:t>
-        </w:r>
-        <w:proofErr w:type="spellEnd"/>
-        <w:r>
-          <w:rPr>
-            <w:rStyle w:val="Hyperlink"/>
-            <w:rFonts w:ascii="Times New Roman" w:eastAsia="Times New Roman" w:hAnsi="Times New Roman"/>
-            <w:sz w:val="24"/>
-            <w:szCs w:val="24"/>
-          </w:rPr>
-          <w:t>/PRT661-DATA-SCIENCE-PRACTICE</w:t>
+          <w:t>PRT661-DATA-SCIENCE-PRACTICE/app.py at main · HendrickDang/PRT661-DATA-SCIENCE-PRACTICE</w:t>
         </w:r>
       </w:hyperlink>
     </w:p>
@@ -3430,27 +2920,7 @@
           <w:szCs w:val="24"/>
           <w:lang w:val="en-AU"/>
         </w:rPr>
-        <w:t xml:space="preserve">Lab 2 (Week 4 materials) - Module 8: Storing and Organizing Data - Lab: Storing and </w:t>
-      </w:r>
-      <w:proofErr w:type="spellStart"/>
-      <w:r>
-        <w:rPr>
-          <w:rFonts w:ascii="Times New Roman" w:eastAsia="Times New Roman" w:hAnsi="Times New Roman"/>
-          <w:sz w:val="24"/>
-          <w:szCs w:val="24"/>
-          <w:lang w:val="en-AU"/>
-        </w:rPr>
-        <w:t>Analyzing</w:t>
-      </w:r>
-      <w:proofErr w:type="spellEnd"/>
-      <w:r>
-        <w:rPr>
-          <w:rFonts w:ascii="Times New Roman" w:eastAsia="Times New Roman" w:hAnsi="Times New Roman"/>
-          <w:sz w:val="24"/>
-          <w:szCs w:val="24"/>
-          <w:lang w:val="en-AU"/>
-        </w:rPr>
-        <w:t xml:space="preserve"> Data by Using Amazon Redshift</w:t>
+        <w:t>Lab 2 (Week 4 materials) - Module 8: Storing and Organizing Data - Lab: Storing and Analyzing Data by Using Amazon Redshift</w:t>
       </w:r>
     </w:p>
     <w:p>
@@ -3500,7 +2970,7 @@
                     </pic:cNvPicPr>
                   </pic:nvPicPr>
                   <pic:blipFill>
-                    <a:blip r:embed="rId28" cstate="print">
+                    <a:blip r:embed="rId30" cstate="print">
                       <a:extLst>
                         <a:ext uri="{28A0092B-C50C-407E-A947-70E740481C1C}">
                           <a14:useLocalDpi xmlns:a14="http://schemas.microsoft.com/office/drawing/2010/main" val="0"/>
@@ -3614,8 +3084,8 @@
       </w:pPr>
     </w:p>
     <w:sectPr>
-      <w:headerReference w:type="default" r:id="rId29"/>
-      <w:footerReference w:type="default" r:id="rId30"/>
+      <w:headerReference w:type="default" r:id="rId31"/>
+      <w:footerReference w:type="default" r:id="rId32"/>
       <w:pgSz w:w="11906" w:h="16838" w:code="9"/>
       <w:pgMar w:top="1440" w:right="1440" w:bottom="1440" w:left="1440" w:header="709" w:footer="709" w:gutter="0"/>
       <w:pgNumType w:start="0"/>
@@ -7035,6 +6505,7 @@
   <w:style w:type="character" w:default="1" w:styleId="DefaultParagraphFont">
     <w:name w:val="Default Paragraph Font"/>
     <w:uiPriority w:val="1"/>
+    <w:semiHidden/>
     <w:unhideWhenUsed/>
   </w:style>
   <w:style w:type="table" w:default="1" w:styleId="TableNormal">
@@ -7823,21 +7294,6 @@
 </file>
 
 <file path=customXml/item2.xml><?xml version="1.0" encoding="utf-8"?>
-<p:properties xmlns:p="http://schemas.microsoft.com/office/2006/metadata/properties" xmlns:xsi="http://www.w3.org/2001/XMLSchema-instance" xmlns:pc="http://schemas.microsoft.com/office/infopath/2007/PartnerControls">
-  <documentManagement/>
-</p:properties>
-</file>
-
-<file path=customXml/item3.xml><?xml version="1.0" encoding="utf-8"?>
-<?mso-contentType ?>
-<FormTemplates xmlns="http://schemas.microsoft.com/sharepoint/v3/contenttype/forms">
-  <Display>DocumentLibraryForm</Display>
-  <Edit>DocumentLibraryForm</Edit>
-  <New>DocumentLibraryForm</New>
-</FormTemplates>
-</file>
-
-<file path=customXml/item4.xml><?xml version="1.0" encoding="utf-8"?>
 <ct:contentTypeSchema xmlns:ct="http://schemas.microsoft.com/office/2006/metadata/contentType" xmlns:ma="http://schemas.microsoft.com/office/2006/metadata/properties/metaAttributes" ct:_="" ma:_="" ma:contentTypeName="Document" ma:contentTypeID="0x010100922A3CA1EE6E4B44833A16005451862E" ma:contentTypeVersion="3" ma:contentTypeDescription="Create a new document." ma:contentTypeScope="" ma:versionID="b712dade4bf8bf57d4a0cdac4d020ae4">
   <xsd:schema xmlns:xsd="http://www.w3.org/2001/XMLSchema" xmlns:xs="http://www.w3.org/2001/XMLSchema" xmlns:p="http://schemas.microsoft.com/office/2006/metadata/properties" xmlns:ns2="92f6da62-8f25-40d3-824c-47c5f6f94bd6" targetNamespace="http://schemas.microsoft.com/office/2006/metadata/properties" ma:root="true" ma:fieldsID="f6f8642a0533a95cbf7fc7bbc8c1e153" ns2:_="">
     <xsd:import namespace="92f6da62-8f25-40d3-824c-47c5f6f94bd6"/>
@@ -7975,6 +7431,21 @@
 </ct:contentTypeSchema>
 </file>
 
+<file path=customXml/item3.xml><?xml version="1.0" encoding="utf-8"?>
+<?mso-contentType ?>
+<FormTemplates xmlns="http://schemas.microsoft.com/sharepoint/v3/contenttype/forms">
+  <Display>DocumentLibraryForm</Display>
+  <Edit>DocumentLibraryForm</Edit>
+  <New>DocumentLibraryForm</New>
+</FormTemplates>
+</file>
+
+<file path=customXml/item4.xml><?xml version="1.0" encoding="utf-8"?>
+<p:properties xmlns:p="http://schemas.microsoft.com/office/2006/metadata/properties" xmlns:xsi="http://www.w3.org/2001/XMLSchema-instance" xmlns:pc="http://schemas.microsoft.com/office/infopath/2007/PartnerControls">
+  <documentManagement/>
+</p:properties>
+</file>
+
 <file path=customXml/itemProps1.xml><?xml version="1.0" encoding="utf-8"?>
 <ds:datastoreItem xmlns:ds="http://schemas.openxmlformats.org/officeDocument/2006/customXml" ds:itemID="{E3DA75CE-018A-4AF1-8B5C-BF0FBFE76924}">
   <ds:schemaRefs>
@@ -7984,23 +7455,6 @@
 </file>
 
 <file path=customXml/itemProps2.xml><?xml version="1.0" encoding="utf-8"?>
-<ds:datastoreItem xmlns:ds="http://schemas.openxmlformats.org/officeDocument/2006/customXml" ds:itemID="{B2E31085-3E06-4A9F-9730-20A04C85DF24}">
-  <ds:schemaRefs>
-    <ds:schemaRef ds:uri="http://schemas.microsoft.com/office/2006/metadata/properties"/>
-    <ds:schemaRef ds:uri="http://schemas.microsoft.com/office/infopath/2007/PartnerControls"/>
-  </ds:schemaRefs>
-</ds:datastoreItem>
-</file>
-
-<file path=customXml/itemProps3.xml><?xml version="1.0" encoding="utf-8"?>
-<ds:datastoreItem xmlns:ds="http://schemas.openxmlformats.org/officeDocument/2006/customXml" ds:itemID="{82A9BB68-56B4-4822-B6B7-DB471576EB1F}">
-  <ds:schemaRefs>
-    <ds:schemaRef ds:uri="http://schemas.microsoft.com/sharepoint/v3/contenttype/forms"/>
-  </ds:schemaRefs>
-</ds:datastoreItem>
-</file>
-
-<file path=customXml/itemProps4.xml><?xml version="1.0" encoding="utf-8"?>
 <ds:datastoreItem xmlns:ds="http://schemas.openxmlformats.org/officeDocument/2006/customXml" ds:itemID="{69960CE0-24F5-4ADF-A12F-FE193FFA9C43}">
   <ds:schemaRefs>
     <ds:schemaRef ds:uri="http://schemas.microsoft.com/office/2006/metadata/contentType"/>
@@ -8016,4 +7470,21 @@
     <ds:schemaRef ds:uri="http://schemas.microsoft.com/internal/obd"/>
   </ds:schemaRefs>
 </ds:datastoreItem>
+</file>
+
+<file path=customXml/itemProps3.xml><?xml version="1.0" encoding="utf-8"?>
+<ds:datastoreItem xmlns:ds="http://schemas.openxmlformats.org/officeDocument/2006/customXml" ds:itemID="{82A9BB68-56B4-4822-B6B7-DB471576EB1F}">
+  <ds:schemaRefs>
+    <ds:schemaRef ds:uri="http://schemas.microsoft.com/sharepoint/v3/contenttype/forms"/>
+  </ds:schemaRefs>
+</ds:datastoreItem>
+</file>
+
+<file path=customXml/itemProps4.xml><?xml version="1.0" encoding="utf-8"?>
+<ds:datastoreItem xmlns:ds="http://schemas.openxmlformats.org/officeDocument/2006/customXml" ds:itemID="{B2E31085-3E06-4A9F-9730-20A04C85DF24}">
+  <ds:schemaRefs>
+    <ds:schemaRef ds:uri="http://schemas.microsoft.com/office/2006/metadata/properties"/>
+    <ds:schemaRef ds:uri="http://schemas.microsoft.com/office/infopath/2007/PartnerControls"/>
+  </ds:schemaRefs>
+</ds:datastoreItem>
 </file>
</xml_diff>

<commit_message>
Update report and submission files
</commit_message>
<xml_diff>
--- a/documents/Assignment 3.docx
+++ b/documents/Assignment 3.docx
@@ -311,29 +311,7 @@
               <w:sz w:val="28"/>
               <w:szCs w:val="28"/>
             </w:rPr>
-            <w:t xml:space="preserve">Lecturer: Dr </w:t>
-          </w:r>
-          <w:proofErr w:type="spellStart"/>
-          <w:r>
-            <w:rPr>
-              <w:rFonts w:ascii="Times New Roman" w:hAnsi="Times New Roman"/>
-              <w:b/>
-              <w:bCs/>
-              <w:sz w:val="28"/>
-              <w:szCs w:val="28"/>
-            </w:rPr>
-            <w:t>Thuseethan</w:t>
-          </w:r>
-          <w:proofErr w:type="spellEnd"/>
-          <w:r>
-            <w:rPr>
-              <w:rFonts w:ascii="Times New Roman" w:hAnsi="Times New Roman"/>
-              <w:b/>
-              <w:bCs/>
-              <w:sz w:val="28"/>
-              <w:szCs w:val="28"/>
-            </w:rPr>
-            <w:t xml:space="preserve"> Selvarajah</w:t>
+            <w:t>Lecturer: Dr Thuseethan Selvarajah</w:t>
           </w:r>
         </w:p>
         <w:p>
@@ -667,27 +645,7 @@
           <w:szCs w:val="24"/>
           <w:lang w:val="en-AU"/>
         </w:rPr>
-        <w:t xml:space="preserve">My main responsibility in the team is the data processing stage. I cleaned, standardised and merged our three source datasets: NT crime statistics, regional population, and wholesale alcohol supply. This meant aligning everything to the same region-by-month level, handling the </w:t>
-      </w:r>
-      <w:proofErr w:type="spellStart"/>
-      <w:r>
-        <w:rPr>
-          <w:rFonts w:ascii="Times New Roman" w:eastAsia="Times New Roman" w:hAnsi="Times New Roman"/>
-          <w:sz w:val="24"/>
-          <w:szCs w:val="24"/>
-          <w:lang w:val="en-AU"/>
-        </w:rPr>
-        <w:t>SerPro</w:t>
-      </w:r>
-      <w:proofErr w:type="spellEnd"/>
-      <w:r>
-        <w:rPr>
-          <w:rFonts w:ascii="Times New Roman" w:eastAsia="Times New Roman" w:hAnsi="Times New Roman"/>
-          <w:sz w:val="24"/>
-          <w:szCs w:val="24"/>
-          <w:lang w:val="en-AU"/>
-        </w:rPr>
-        <w:t xml:space="preserve"> system change and the ANZSOC reclassification, and making sure the merged dataset was ready for modelling. I also took on the monitoring stage, which tracks how the model performs as new data comes in.</w:t>
+        <w:t>My main responsibility in the team is the data processing stage. I cleaned, standardised and merged our three source datasets: NT crime statistics, regional population, and wholesale alcohol supply. This meant aligning everything to the same region-by-month level, handling the SerPro system change and the ANZSOC reclassification, and making sure the merged dataset was ready for modelling. I also took on the monitoring stage, which tracks how the model performs as new data comes in.</w:t>
       </w:r>
     </w:p>
     <w:p>
@@ -1202,7 +1160,23 @@
           <w:sz w:val="24"/>
           <w:szCs w:val="24"/>
         </w:rPr>
-        <w:t xml:space="preserve">Laboratory 4 </w:t>
+        <w:t xml:space="preserve">Laboratory </w:t>
+      </w:r>
+      <w:r>
+        <w:rPr>
+          <w:rFonts w:ascii="Times New Roman" w:eastAsia="Times New Roman" w:hAnsi="Times New Roman"/>
+          <w:sz w:val="24"/>
+          <w:szCs w:val="24"/>
+        </w:rPr>
+        <w:t>2</w:t>
+      </w:r>
+      <w:r>
+        <w:rPr>
+          <w:rFonts w:ascii="Times New Roman" w:eastAsia="Times New Roman" w:hAnsi="Times New Roman"/>
+          <w:sz w:val="24"/>
+          <w:szCs w:val="24"/>
+        </w:rPr>
+        <w:t xml:space="preserve"> </w:t>
       </w:r>
       <w:r>
         <w:rPr>
@@ -1219,25 +1193,7 @@
           <w:sz w:val="24"/>
           <w:szCs w:val="24"/>
         </w:rPr>
-        <w:t xml:space="preserve"> Lab: Storing and </w:t>
-      </w:r>
-      <w:proofErr w:type="spellStart"/>
-      <w:r>
-        <w:rPr>
-          <w:rFonts w:ascii="Times New Roman" w:eastAsia="Times New Roman" w:hAnsi="Times New Roman"/>
-          <w:sz w:val="24"/>
-          <w:szCs w:val="24"/>
-        </w:rPr>
-        <w:t>Analyzing</w:t>
-      </w:r>
-      <w:proofErr w:type="spellEnd"/>
-      <w:r>
-        <w:rPr>
-          <w:rFonts w:ascii="Times New Roman" w:eastAsia="Times New Roman" w:hAnsi="Times New Roman"/>
-          <w:sz w:val="24"/>
-          <w:szCs w:val="24"/>
-        </w:rPr>
-        <w:t xml:space="preserve"> Data by Using Amazon Redshift</w:t>
+        <w:t xml:space="preserve"> Lab: Storing and Analyzing Data by Using Amazon Redshift</w:t>
       </w:r>
     </w:p>
     <w:p>
@@ -1520,67 +1476,7 @@
           <w:szCs w:val="24"/>
           <w:lang w:val="en-AU"/>
         </w:rPr>
-        <w:t xml:space="preserve">My role in the team is analytics and machine learning. I own the modelling and the evaluation module, which compares Linear Regression, Ridge, Lasso and </w:t>
-      </w:r>
-      <w:proofErr w:type="spellStart"/>
-      <w:r>
-        <w:rPr>
-          <w:rFonts w:ascii="Times New Roman" w:eastAsia="Times New Roman" w:hAnsi="Times New Roman"/>
-          <w:sz w:val="24"/>
-          <w:szCs w:val="24"/>
-          <w:lang w:val="en-AU"/>
-        </w:rPr>
-        <w:t>XGBoost</w:t>
-      </w:r>
-      <w:proofErr w:type="spellEnd"/>
-      <w:r>
-        <w:rPr>
-          <w:rFonts w:ascii="Times New Roman" w:eastAsia="Times New Roman" w:hAnsi="Times New Roman"/>
-          <w:sz w:val="24"/>
-          <w:szCs w:val="24"/>
-          <w:lang w:val="en-AU"/>
-        </w:rPr>
-        <w:t xml:space="preserve"> against two simple baselines using a rolling-origin </w:t>
-      </w:r>
-      <w:proofErr w:type="spellStart"/>
-      <w:r>
-        <w:rPr>
-          <w:rFonts w:ascii="Times New Roman" w:eastAsia="Times New Roman" w:hAnsi="Times New Roman"/>
-          <w:sz w:val="24"/>
-          <w:szCs w:val="24"/>
-          <w:lang w:val="en-AU"/>
-        </w:rPr>
-        <w:t>backtest</w:t>
-      </w:r>
-      <w:proofErr w:type="spellEnd"/>
-      <w:r>
-        <w:rPr>
-          <w:rFonts w:ascii="Times New Roman" w:eastAsia="Times New Roman" w:hAnsi="Times New Roman"/>
-          <w:sz w:val="24"/>
-          <w:szCs w:val="24"/>
-          <w:lang w:val="en-AU"/>
-        </w:rPr>
-        <w:t xml:space="preserve">. The main result is a split recommendation: </w:t>
-      </w:r>
-      <w:proofErr w:type="spellStart"/>
-      <w:r>
-        <w:rPr>
-          <w:rFonts w:ascii="Times New Roman" w:eastAsia="Times New Roman" w:hAnsi="Times New Roman"/>
-          <w:sz w:val="24"/>
-          <w:szCs w:val="24"/>
-          <w:lang w:val="en-AU"/>
-        </w:rPr>
-        <w:t>XGBoost</w:t>
-      </w:r>
-      <w:proofErr w:type="spellEnd"/>
-      <w:r>
-        <w:rPr>
-          <w:rFonts w:ascii="Times New Roman" w:eastAsia="Times New Roman" w:hAnsi="Times New Roman"/>
-          <w:sz w:val="24"/>
-          <w:szCs w:val="24"/>
-          <w:lang w:val="en-AU"/>
-        </w:rPr>
-        <w:t xml:space="preserve"> for forecasts one month ahead (RMSE 90.7 per 100,000, about 30% better than seasonal naive) and a 12-month moving average from three months onward.</w:t>
+        <w:t>My role in the team is analytics and machine learning. I own the modelling and the evaluation module, which compares Linear Regression, Ridge, Lasso and XGBoost against two simple baselines using a rolling-origin backtest. The main result is a split recommendation: XGBoost for forecasts one month ahead (RMSE 90.7 per 100,000, about 30% better than seasonal naive) and a 12-month moving average from three months onward.</w:t>
       </w:r>
     </w:p>
     <w:p>
@@ -1604,27 +1500,7 @@
           <w:szCs w:val="24"/>
           <w:lang w:val="en-AU"/>
         </w:rPr>
-        <w:t xml:space="preserve">Since Assessment 2, I added the execution instructions, the model documentation and the workflow diagram to the repository, and updated the change log, README and requirements file so every reported figure can be regenerated. For Assessment 3, I prepared and presented slides 12 to 16: model performance, the </w:t>
-      </w:r>
-      <w:proofErr w:type="spellStart"/>
-      <w:r>
-        <w:rPr>
-          <w:rFonts w:ascii="Times New Roman" w:eastAsia="Times New Roman" w:hAnsi="Times New Roman"/>
-          <w:sz w:val="24"/>
-          <w:szCs w:val="24"/>
-          <w:lang w:val="en-AU"/>
-        </w:rPr>
-        <w:t>backtest</w:t>
-      </w:r>
-      <w:proofErr w:type="spellEnd"/>
-      <w:r>
-        <w:rPr>
-          <w:rFonts w:ascii="Times New Roman" w:eastAsia="Times New Roman" w:hAnsi="Times New Roman"/>
-          <w:sz w:val="24"/>
-          <w:szCs w:val="24"/>
-          <w:lang w:val="en-AU"/>
-        </w:rPr>
-        <w:t>, the alcohol supply comparison, technical challenges, and ethics. Before recording, I re-ran the pipeline and checked every figure against its output. This found out-of-date values in the alcohol model table, which I corrected, and wording errors on other slides, which I passed to the team. I also manage the group's GitHub repository and Jira site.</w:t>
+        <w:t>Since Assessment 2, I added the execution instructions, the model documentation and the workflow diagram to the repository, and updated the change log, README and requirements file so every reported figure can be regenerated. For Assessment 3, I prepared and presented slides 12 to 16: model performance, the backtest, the alcohol supply comparison, technical challenges, and ethics. Before recording, I re-ran the pipeline and checked every figure against its output. This found out-of-date values in the alcohol model table, which I corrected, and wording errors on other slides, which I passed to the team. I also manage the group's GitHub repository and Jira site.</w:t>
       </w:r>
     </w:p>
     <w:p>
@@ -1880,47 +1756,7 @@
           <w:szCs w:val="24"/>
           <w:lang w:val="en-AU"/>
         </w:rPr>
-        <w:t xml:space="preserve">Before Assessment 4, I plan to save the tuned models with </w:t>
-      </w:r>
-      <w:proofErr w:type="spellStart"/>
-      <w:r>
-        <w:rPr>
-          <w:rFonts w:ascii="Times New Roman" w:eastAsia="Times New Roman" w:hAnsi="Times New Roman"/>
-          <w:sz w:val="24"/>
-          <w:szCs w:val="24"/>
-          <w:lang w:val="en-AU"/>
-        </w:rPr>
-        <w:t>joblib</w:t>
-      </w:r>
-      <w:proofErr w:type="spellEnd"/>
-      <w:r>
-        <w:rPr>
-          <w:rFonts w:ascii="Times New Roman" w:eastAsia="Times New Roman" w:hAnsi="Times New Roman"/>
-          <w:sz w:val="24"/>
-          <w:szCs w:val="24"/>
-          <w:lang w:val="en-AU"/>
-        </w:rPr>
-        <w:t xml:space="preserve"> so the dashboard can load them without re-running the pipeline, and to work with Thomas to show the </w:t>
-      </w:r>
-      <w:proofErr w:type="spellStart"/>
-      <w:r>
-        <w:rPr>
-          <w:rFonts w:ascii="Times New Roman" w:eastAsia="Times New Roman" w:hAnsi="Times New Roman"/>
-          <w:sz w:val="24"/>
-          <w:szCs w:val="24"/>
-          <w:lang w:val="en-AU"/>
-        </w:rPr>
-        <w:t>backtest</w:t>
-      </w:r>
-      <w:proofErr w:type="spellEnd"/>
-      <w:r>
-        <w:rPr>
-          <w:rFonts w:ascii="Times New Roman" w:eastAsia="Times New Roman" w:hAnsi="Times New Roman"/>
-          <w:sz w:val="24"/>
-          <w:szCs w:val="24"/>
-          <w:lang w:val="en-AU"/>
-        </w:rPr>
-        <w:t xml:space="preserve"> forecasts and prediction intervals in the dashboard. </w:t>
+        <w:t xml:space="preserve">Before Assessment 4, I plan to save the tuned models with joblib so the dashboard can load them without re-running the pipeline, and to work with Thomas to show the backtest forecasts and prediction intervals in the dashboard. </w:t>
       </w:r>
       <w:r>
         <w:rPr>
@@ -1938,7 +1774,7 @@
           <w:szCs w:val="24"/>
           <w:lang w:val="en-AU"/>
         </w:rPr>
-        <w:t>, finalise the drift thresholds with Emma for the monitoring stage, and write the modelling and evaluation sections of the final report.</w:t>
+        <w:t xml:space="preserve"> finalise the drift thresholds with Emma for the monitoring stage, and write the modelling and evaluation sections of the final report.</w:t>
       </w:r>
     </w:p>
     <w:p>
@@ -1996,27 +1832,7 @@
           <w:szCs w:val="24"/>
           <w:lang w:val="en-AU"/>
         </w:rPr>
-        <w:t xml:space="preserve">Lab 2 (Week 4 materials) - Module 8: Storing and Organizing Data - Lab: Storing and </w:t>
-      </w:r>
-      <w:proofErr w:type="spellStart"/>
-      <w:r>
-        <w:rPr>
-          <w:rFonts w:ascii="Times New Roman" w:eastAsia="Times New Roman" w:hAnsi="Times New Roman"/>
-          <w:sz w:val="24"/>
-          <w:szCs w:val="24"/>
-          <w:lang w:val="en-AU"/>
-        </w:rPr>
-        <w:t>Analyzing</w:t>
-      </w:r>
-      <w:proofErr w:type="spellEnd"/>
-      <w:r>
-        <w:rPr>
-          <w:rFonts w:ascii="Times New Roman" w:eastAsia="Times New Roman" w:hAnsi="Times New Roman"/>
-          <w:sz w:val="24"/>
-          <w:szCs w:val="24"/>
-          <w:lang w:val="en-AU"/>
-        </w:rPr>
-        <w:t xml:space="preserve"> Data by Using Amazon Redshift</w:t>
+        <w:t>Lab 2 (Week 4 materials) - Module 8: Storing and Organizing Data - Lab: Storing and Analyzing Data by Using Amazon Redshift</w:t>
       </w:r>
     </w:p>
     <w:p>
@@ -2129,16 +1945,7 @@
           <w:szCs w:val="24"/>
           <w:lang w:val="en-AU"/>
         </w:rPr>
-        <w:t>In this lab I created a Redshift cluster, attached an IAM role so it could read from S3, defined three tables, loaded them with COPY, and queried them from the console and from the AWS CLI. Two things stood out. First, loading only works when the schema, delimiter and time format are stated exactly, so the structure has to</w:t>
-      </w:r>
-      <w:r>
-        <w:rPr>
-          <w:rFonts w:ascii="Times New Roman" w:eastAsia="Times New Roman" w:hAnsi="Times New Roman"/>
-          <w:sz w:val="24"/>
-          <w:szCs w:val="24"/>
-          <w:lang w:val="en-AU"/>
-        </w:rPr>
-        <w:t xml:space="preserve"> be decided before the data arrives. Second, the Data API is asynchronous: one command submits the query and returns an ID, and a second command fetches the result. I also ran the same query with another user's credentials to confirm that a restricted policy still gave her the access she needed.</w:t>
+        <w:t>In this lab I created a Redshift cluster, attached an IAM role so it could read from S3, defined three tables, loaded them with COPY, and queried them from the console and from the AWS CLI. Two things stood out. First, loading only works when the schema, delimiter and time format are stated exactly, so the structure has to be decided before the data arrives. Second, the Data API is asynchronous: one command submits the query and returns an ID, and a second command fetches the result. I also ran the same query with another user's credentials to confirm that a restricted policy still gave her the access she needed.</w:t>
       </w:r>
     </w:p>
     <w:p>
@@ -2162,76 +1969,16 @@
           <w:szCs w:val="24"/>
           <w:lang w:val="en-AU"/>
         </w:rPr>
-        <w:t xml:space="preserve">We do not use Redshift in our project, but I applied these ideas to the modelling work. Testing as a different user is the same idea as checking that our results reproduce on another machine: when a teammate got a different </w:t>
-      </w:r>
-      <w:proofErr w:type="spellStart"/>
-      <w:r>
-        <w:rPr>
-          <w:rFonts w:ascii="Times New Roman" w:eastAsia="Times New Roman" w:hAnsi="Times New Roman"/>
-          <w:sz w:val="24"/>
-          <w:szCs w:val="24"/>
-          <w:lang w:val="en-AU"/>
-        </w:rPr>
-        <w:t>XGBoost</w:t>
-      </w:r>
-      <w:proofErr w:type="spellEnd"/>
-      <w:r>
-        <w:rPr>
-          <w:rFonts w:ascii="Times New Roman" w:eastAsia="Times New Roman" w:hAnsi="Times New Roman"/>
-          <w:sz w:val="24"/>
-          <w:szCs w:val="24"/>
-          <w:lang w:val="en-AU"/>
-        </w:rPr>
-        <w:t xml:space="preserve"> error from mine, </w:t>
-      </w:r>
-      <w:r>
-        <w:rPr>
-          <w:rFonts w:ascii="Times New Roman" w:eastAsia="Times New Roman" w:hAnsi="Times New Roman"/>
-          <w:sz w:val="24"/>
-          <w:szCs w:val="24"/>
-          <w:lang w:val="en-AU"/>
-        </w:rPr>
-        <w:t xml:space="preserve">when a teammate got a different </w:t>
-      </w:r>
-      <w:proofErr w:type="spellStart"/>
-      <w:r>
-        <w:rPr>
-          <w:rFonts w:ascii="Times New Roman" w:eastAsia="Times New Roman" w:hAnsi="Times New Roman"/>
-          <w:sz w:val="24"/>
-          <w:szCs w:val="24"/>
-          <w:lang w:val="en-AU"/>
-        </w:rPr>
-        <w:t>XGBoost</w:t>
-      </w:r>
-      <w:proofErr w:type="spellEnd"/>
-      <w:r>
-        <w:rPr>
-          <w:rFonts w:ascii="Times New Roman" w:eastAsia="Times New Roman" w:hAnsi="Times New Roman"/>
-          <w:sz w:val="24"/>
-          <w:szCs w:val="24"/>
-          <w:lang w:val="en-AU"/>
-        </w:rPr>
-        <w:t xml:space="preserve"> error from mine, I pinned the package versions. The linear models now match exactly, and the small </w:t>
-      </w:r>
-      <w:proofErr w:type="spellStart"/>
-      <w:r>
-        <w:rPr>
-          <w:rFonts w:ascii="Times New Roman" w:eastAsia="Times New Roman" w:hAnsi="Times New Roman"/>
-          <w:sz w:val="24"/>
-          <w:szCs w:val="24"/>
-          <w:lang w:val="en-AU"/>
-        </w:rPr>
-        <w:t>XGBoost</w:t>
-      </w:r>
-      <w:proofErr w:type="spellEnd"/>
-      <w:r>
-        <w:rPr>
-          <w:rFonts w:ascii="Times New Roman" w:eastAsia="Times New Roman" w:hAnsi="Times New Roman"/>
-          <w:sz w:val="24"/>
-          <w:szCs w:val="24"/>
-          <w:lang w:val="en-AU"/>
-        </w:rPr>
-        <w:t xml:space="preserve"> difference that remains is documented as a platform effect</w:t>
+        <w:t>We do not use Redshift in our project, but I applied these ideas to the modelling work. Testing as a different user is the same idea as checking that our results reproduce on another machine: when a teammate got a different XGBoost error from mine</w:t>
+      </w:r>
+      <w:r>
+        <w:rPr>
+          <w:rFonts w:ascii="Times New Roman" w:eastAsia="Times New Roman" w:hAnsi="Times New Roman"/>
+          <w:sz w:val="24"/>
+          <w:szCs w:val="24"/>
+          <w:lang w:val="en-AU"/>
+        </w:rPr>
+        <w:t>, I pinned the package versions. The linear models now match exactly, and the small XGBoost difference that remains is documented as a platform effect</w:t>
       </w:r>
       <w:r>
         <w:rPr>
@@ -2389,15 +2136,7 @@
         <w:jc w:val="both"/>
       </w:pPr>
       <w:r>
-        <w:t xml:space="preserve">My role is data engineering. I own the ingest and storage stages that every later stage depends on: the ingest stage loads the six source files, runs structural checks and logs each run in </w:t>
-      </w:r>
-      <w:proofErr w:type="spellStart"/>
-      <w:r>
-        <w:t>manifest.json</w:t>
-      </w:r>
-      <w:proofErr w:type="spellEnd"/>
-      <w:r>
-        <w:t>, while the source → raw → processed layout keeps the original downloads untouched.</w:t>
+        <w:t>My role is data engineering. I own the ingest and storage stages that every later stage depends on: the ingest stage loads the six source files, runs structural checks and logs each run in manifest.json, while the source → raw → processed layout keeps the original downloads untouched.</w:t>
       </w:r>
     </w:p>
     <w:p>
@@ -2406,15 +2145,7 @@
         <w:jc w:val="both"/>
       </w:pPr>
       <w:r>
-        <w:t xml:space="preserve">Since Assessment 2, I built a read-only data lineage and reproducibility audit (pull request #8). It traces every row count from 55,146 raw crime rows to the 696-row model panel (504 train, 192 test), showing that our slides misstate the record count and that training actually starts in 2016, not 2015. A clean-clone rerun with pinned versions reproduced the linear models exactly; </w:t>
-      </w:r>
-      <w:proofErr w:type="spellStart"/>
-      <w:r>
-        <w:t>XGBoost</w:t>
-      </w:r>
-      <w:proofErr w:type="spellEnd"/>
-      <w:r>
-        <w:t xml:space="preserve"> gave 80.7 instead of 84.5 RMSE per 100k on another platform, but our conclusions hold. </w:t>
+        <w:t xml:space="preserve">Since Assessment 2, I built a read-only data lineage and reproducibility audit (pull request #8). It traces every row count from 55,146 raw crime rows to the 696-row model panel (504 train, 192 test), showing that our slides misstate the record count and that training actually starts in 2016, not 2015. A clean-clone rerun with pinned versions reproduced the linear models exactly; XGBoost gave 80.7 instead of 84.5 RMSE per 100k on another platform, but our conclusions hold. </w:t>
       </w:r>
     </w:p>
     <w:p>
@@ -2423,31 +2154,7 @@
         <w:jc w:val="both"/>
       </w:pPr>
       <w:r>
-        <w:t xml:space="preserve">Most importantly, it found that </w:t>
-      </w:r>
-      <w:proofErr w:type="spellStart"/>
-      <w:r>
-        <w:t>Alcohol_offences</w:t>
-      </w:r>
-      <w:proofErr w:type="spellEnd"/>
-      <w:r>
-        <w:t xml:space="preserve"> and </w:t>
-      </w:r>
-      <w:proofErr w:type="spellStart"/>
-      <w:r>
-        <w:t>DV_offences</w:t>
-      </w:r>
-      <w:proofErr w:type="spellEnd"/>
-      <w:r>
-        <w:t xml:space="preserve"> are counted from the same month as the target (49% and 64% of target offences, correlation up to 0.97). This is a leakage risk for the single-split results but not for the rolling-origin </w:t>
-      </w:r>
-      <w:proofErr w:type="spellStart"/>
-      <w:r>
-        <w:t>backtest</w:t>
-      </w:r>
-      <w:proofErr w:type="spellEnd"/>
-      <w:r>
-        <w:t>, and I documented it with a suggested fix. For Assessment 3, I also prepared the first draft of the slide deck and present slides 1 to 6.</w:t>
+        <w:t>Most importantly, it found that Alcohol_offences and DV_offences are counted from the same month as the target (49% and 64% of target offences, correlation up to 0.97). This is a leakage risk for the single-split results but not for the rolling-origin backtest, and I documented it with a suggested fix. For Assessment 3, I also prepared the first draft of the slide deck and present slides 1 to 6.</w:t>
       </w:r>
     </w:p>
     <w:p>
@@ -2761,27 +2468,25 @@
           <w:szCs w:val="24"/>
           <w:lang w:val="en-AU"/>
         </w:rPr>
-        <w:t xml:space="preserve">Laboratory 4 - Module 8 Lab: Storing and </w:t>
-      </w:r>
-      <w:proofErr w:type="spellStart"/>
-      <w:r>
-        <w:rPr>
-          <w:rFonts w:ascii="Times New Roman" w:eastAsia="Times New Roman" w:hAnsi="Times New Roman"/>
-          <w:sz w:val="24"/>
-          <w:szCs w:val="24"/>
-          <w:lang w:val="en-AU"/>
-        </w:rPr>
-        <w:t>Analyzing</w:t>
-      </w:r>
-      <w:proofErr w:type="spellEnd"/>
-      <w:r>
-        <w:rPr>
-          <w:rFonts w:ascii="Times New Roman" w:eastAsia="Times New Roman" w:hAnsi="Times New Roman"/>
-          <w:sz w:val="24"/>
-          <w:szCs w:val="24"/>
-          <w:lang w:val="en-AU"/>
-        </w:rPr>
-        <w:t xml:space="preserve"> Data by Using Amazon Redshift</w:t>
+        <w:t xml:space="preserve">Laboratory </w:t>
+      </w:r>
+      <w:r>
+        <w:rPr>
+          <w:rFonts w:ascii="Times New Roman" w:eastAsia="Times New Roman" w:hAnsi="Times New Roman"/>
+          <w:sz w:val="24"/>
+          <w:szCs w:val="24"/>
+          <w:lang w:val="en-AU"/>
+        </w:rPr>
+        <w:t>2</w:t>
+      </w:r>
+      <w:r>
+        <w:rPr>
+          <w:rFonts w:ascii="Times New Roman" w:eastAsia="Times New Roman" w:hAnsi="Times New Roman"/>
+          <w:sz w:val="24"/>
+          <w:szCs w:val="24"/>
+          <w:lang w:val="en-AU"/>
+        </w:rPr>
+        <w:t xml:space="preserve"> - Module 8 Lab: Storing and Analyzing Data by Using Amazon Redshift</w:t>
       </w:r>
     </w:p>
     <w:p>
@@ -2804,7 +2509,7 @@
           <w:szCs w:val="24"/>
         </w:rPr>
         <w:drawing>
-          <wp:inline distT="0" distB="0" distL="0" distR="0" wp14:anchorId="7A07F2FB" wp14:editId="35B10585">
+          <wp:inline distT="0" distB="0" distL="0" distR="0" wp14:anchorId="7A07F2FB" wp14:editId="7F23CAC3">
             <wp:extent cx="5746290" cy="3232846"/>
             <wp:effectExtent l="0" t="0" r="6985" b="5715"/>
             <wp:docPr id="1286285774" name="Picture 2"/>
@@ -3028,25 +2733,7 @@
           <w:sz w:val="24"/>
           <w:szCs w:val="24"/>
         </w:rPr>
-        <w:t xml:space="preserve"> I built the interactive </w:t>
-      </w:r>
-      <w:proofErr w:type="spellStart"/>
-      <w:r>
-        <w:rPr>
-          <w:rFonts w:ascii="Times New Roman" w:eastAsia="Times New Roman" w:hAnsi="Times New Roman"/>
-          <w:sz w:val="24"/>
-          <w:szCs w:val="24"/>
-        </w:rPr>
-        <w:t>Streamlit</w:t>
-      </w:r>
-      <w:proofErr w:type="spellEnd"/>
-      <w:r>
-        <w:rPr>
-          <w:rFonts w:ascii="Times New Roman" w:eastAsia="Times New Roman" w:hAnsi="Times New Roman"/>
-          <w:sz w:val="24"/>
-          <w:szCs w:val="24"/>
-        </w:rPr>
-        <w:t xml:space="preserve"> decision-support dashboard and co-developed the machine-learning forecasting layer that powers it. On the dashboard side, I created the dual-role portal </w:t>
+        <w:t xml:space="preserve"> I built the interactive Streamlit decision-support dashboard and co-developed the machine-learning forecasting layer that powers it. On the dashboard side, I created the dual-role portal </w:t>
       </w:r>
       <w:r>
         <w:rPr>
@@ -3062,25 +2749,7 @@
           <w:sz w:val="24"/>
           <w:szCs w:val="24"/>
         </w:rPr>
-        <w:t xml:space="preserve">a non-technical Administrator Portal for policy makers and police (KPI briefing, an interactive </w:t>
-      </w:r>
-      <w:proofErr w:type="spellStart"/>
-      <w:r>
-        <w:rPr>
-          <w:rFonts w:ascii="Times New Roman" w:eastAsia="Times New Roman" w:hAnsi="Times New Roman"/>
-          <w:sz w:val="24"/>
-          <w:szCs w:val="24"/>
-        </w:rPr>
-        <w:t>Plotly</w:t>
-      </w:r>
-      <w:proofErr w:type="spellEnd"/>
-      <w:r>
-        <w:rPr>
-          <w:rFonts w:ascii="Times New Roman" w:eastAsia="Times New Roman" w:hAnsi="Times New Roman"/>
-          <w:sz w:val="24"/>
-          <w:szCs w:val="24"/>
-        </w:rPr>
-        <w:t xml:space="preserve"> spatial crime map, a staffing priority matrix, a seasonal surge calendar, a policy intervention simulator, and briefing export) and a technical Data Science Workbench for reviewers (EDA, PCA, feature selection/VIF, hyperparameter curves, Model A vs B, and residual diagnostics)</w:t>
+        <w:t>a non-technical Administrator Portal for policy makers and police (KPI briefing, an interactive Plotly spatial crime map, a staffing priority matrix, a seasonal surge calendar, a policy intervention simulator, and briefing export) and a technical Data Science Workbench for reviewers (EDA, PCA, feature selection/VIF, hyperparameter curves, Model A vs B, and residual diagnostics)</w:t>
       </w:r>
       <w:r>
         <w:rPr>
@@ -3128,25 +2797,7 @@
           <w:sz w:val="24"/>
           <w:szCs w:val="24"/>
         </w:rPr>
-        <w:t xml:space="preserve">. On the machine-learning side, I co-developed the forecasting suite, building leakage-free feature variants V1–V4 with time-series cross-validation, performing backward-elimination and VIF feature selection, tuning Ridge, Lasso and </w:t>
-      </w:r>
-      <w:proofErr w:type="spellStart"/>
-      <w:r>
-        <w:rPr>
-          <w:rFonts w:ascii="Times New Roman" w:eastAsia="Times New Roman" w:hAnsi="Times New Roman"/>
-          <w:sz w:val="24"/>
-          <w:szCs w:val="24"/>
-        </w:rPr>
-        <w:t>XGBoost</w:t>
-      </w:r>
-      <w:proofErr w:type="spellEnd"/>
-      <w:r>
-        <w:rPr>
-          <w:rFonts w:ascii="Times New Roman" w:eastAsia="Times New Roman" w:hAnsi="Times New Roman"/>
-          <w:sz w:val="24"/>
-          <w:szCs w:val="24"/>
-        </w:rPr>
-        <w:t>, and wiring the trained model into the dashboard's simulator so it produces live predictions from user-adjusted inputs.</w:t>
+        <w:t>. On the machine-learning side, I co-developed the forecasting suite, building leakage-free feature variants V1–V4 with time-series cross-validation, performing backward-elimination and VIF feature selection, tuning Ridge, Lasso and XGBoost, and wiring the trained model into the dashboard's simulator so it produces live predictions from user-adjusted inputs.</w:t>
       </w:r>
     </w:p>
     <w:p>
@@ -3264,61 +2915,7 @@
           <w:sz w:val="24"/>
           <w:szCs w:val="24"/>
         </w:rPr>
-        <w:t xml:space="preserve"> I plan to improve the dashboard from a local prototype into a complete, deployed forecasting tool for PFES: I will add a multi-horizon forecast view (1/3/6/12 months) with prediction intervals and an automatic split-specification switcher (</w:t>
-      </w:r>
-      <w:proofErr w:type="spellStart"/>
-      <w:r>
-        <w:rPr>
-          <w:rFonts w:ascii="Times New Roman" w:eastAsia="Times New Roman" w:hAnsi="Times New Roman"/>
-          <w:sz w:val="24"/>
-          <w:szCs w:val="24"/>
-        </w:rPr>
-        <w:t>XGBoost</w:t>
-      </w:r>
-      <w:proofErr w:type="spellEnd"/>
-      <w:r>
-        <w:rPr>
-          <w:rFonts w:ascii="Times New Roman" w:eastAsia="Times New Roman" w:hAnsi="Times New Roman"/>
-          <w:sz w:val="24"/>
-          <w:szCs w:val="24"/>
-        </w:rPr>
-        <w:t xml:space="preserve"> at one month, moving average beyond), load serialised </w:t>
-      </w:r>
-      <w:proofErr w:type="spellStart"/>
-      <w:r>
-        <w:rPr>
-          <w:rFonts w:ascii="Times New Roman" w:eastAsia="Times New Roman" w:hAnsi="Times New Roman"/>
-          <w:sz w:val="24"/>
-          <w:szCs w:val="24"/>
-        </w:rPr>
-        <w:t>joblib</w:t>
-      </w:r>
-      <w:proofErr w:type="spellEnd"/>
-      <w:r>
-        <w:rPr>
-          <w:rFonts w:ascii="Times New Roman" w:eastAsia="Times New Roman" w:hAnsi="Times New Roman"/>
-          <w:sz w:val="24"/>
-          <w:szCs w:val="24"/>
-        </w:rPr>
-        <w:t xml:space="preserve"> models so the dashboard matches the report exactly rather than retraining, deploy the app to </w:t>
-      </w:r>
-      <w:proofErr w:type="spellStart"/>
-      <w:r>
-        <w:rPr>
-          <w:rFonts w:ascii="Times New Roman" w:eastAsia="Times New Roman" w:hAnsi="Times New Roman"/>
-          <w:sz w:val="24"/>
-          <w:szCs w:val="24"/>
-        </w:rPr>
-        <w:t>Streamlit</w:t>
-      </w:r>
-      <w:proofErr w:type="spellEnd"/>
-      <w:r>
-        <w:rPr>
-          <w:rFonts w:ascii="Times New Roman" w:eastAsia="Times New Roman" w:hAnsi="Times New Roman"/>
-          <w:sz w:val="24"/>
-          <w:szCs w:val="24"/>
-        </w:rPr>
-        <w:t xml:space="preserve"> Community Cloud (fixing the cross-platform Outputs/ path case bug), and align the features with the corrected lagged alcohol/DV model, plus annotate structural breaks and provisional months in the UI</w:t>
+        <w:t xml:space="preserve"> I plan to improve the dashboard from a local prototype into a complete, deployed forecasting tool for PFES: I will add a multi-horizon forecast view (1/3/6/12 months) with prediction intervals and an automatic split-specification switcher (XGBoost at one month, moving average beyond), load serialised joblib models so the dashboard matches the report exactly rather than retraining, deploy the app to Streamlit Community Cloud (fixing the cross-platform Outputs/ path case bug), and align the features with the corrected lagged alcohol/DV model, plus annotate structural breaks and provisional months in the UI</w:t>
       </w:r>
       <w:r>
         <w:rPr>
@@ -3377,70 +2974,18 @@
         </w:rPr>
         <w:t xml:space="preserve">GitHub repository: </w:t>
       </w:r>
-      <w:r>
-        <w:rPr>
-          <w:rFonts w:ascii="Times New Roman" w:eastAsia="Times New Roman" w:hAnsi="Times New Roman"/>
-          <w:sz w:val="24"/>
-          <w:szCs w:val="24"/>
-          <w:lang w:val="vi-VN"/>
-        </w:rPr>
-        <w:fldChar w:fldCharType="begin"/>
-      </w:r>
-      <w:r>
-        <w:rPr>
-          <w:rFonts w:ascii="Times New Roman" w:eastAsia="Times New Roman" w:hAnsi="Times New Roman"/>
-          <w:sz w:val="24"/>
-          <w:szCs w:val="24"/>
-          <w:lang w:val="vi-VN"/>
-        </w:rPr>
-        <w:instrText>HYPERLINK "</w:instrText>
-      </w:r>
-      <w:r>
-        <w:rPr>
-          <w:rFonts w:ascii="Times New Roman" w:eastAsia="Times New Roman" w:hAnsi="Times New Roman"/>
-          <w:sz w:val="24"/>
-          <w:szCs w:val="24"/>
-          <w:lang w:val="vi-VN"/>
-        </w:rPr>
-        <w:instrText>https://github.com/HendrickDang/PRT661-DATA-SCIENCE-PRACTICE/commits?author=thomastran2k2</w:instrText>
-      </w:r>
-      <w:r>
-        <w:rPr>
-          <w:rFonts w:ascii="Times New Roman" w:eastAsia="Times New Roman" w:hAnsi="Times New Roman"/>
-          <w:sz w:val="24"/>
-          <w:szCs w:val="24"/>
-          <w:lang w:val="vi-VN"/>
-        </w:rPr>
-        <w:instrText>"</w:instrText>
-      </w:r>
-      <w:r>
-        <w:rPr>
-          <w:rFonts w:ascii="Times New Roman" w:eastAsia="Times New Roman" w:hAnsi="Times New Roman"/>
-          <w:sz w:val="24"/>
-          <w:szCs w:val="24"/>
-          <w:lang w:val="vi-VN"/>
-        </w:rPr>
-        <w:fldChar w:fldCharType="separate"/>
-      </w:r>
-      <w:r>
-        <w:rPr>
-          <w:rStyle w:val="Hyperlink"/>
-          <w:rFonts w:ascii="Times New Roman" w:eastAsia="Times New Roman" w:hAnsi="Times New Roman"/>
-          <w:sz w:val="24"/>
-          <w:szCs w:val="24"/>
-          <w:lang w:val="vi-VN"/>
-        </w:rPr>
-        <w:t>https://github.com/HendrickDang/PRT661-DATA-SCIENCE-PRACTICE/commits?author=thomastran2k2</w:t>
-      </w:r>
-      <w:r>
-        <w:rPr>
-          <w:rFonts w:ascii="Times New Roman" w:eastAsia="Times New Roman" w:hAnsi="Times New Roman"/>
-          <w:sz w:val="24"/>
-          <w:szCs w:val="24"/>
-          <w:lang w:val="vi-VN"/>
-        </w:rPr>
-        <w:fldChar w:fldCharType="end"/>
-      </w:r>
+      <w:hyperlink r:id="rId29" w:history="1">
+        <w:r>
+          <w:rPr>
+            <w:rStyle w:val="Hyperlink"/>
+            <w:rFonts w:ascii="Times New Roman" w:eastAsia="Times New Roman" w:hAnsi="Times New Roman"/>
+            <w:sz w:val="24"/>
+            <w:szCs w:val="24"/>
+            <w:lang w:val="vi-VN"/>
+          </w:rPr>
+          <w:t>https://github.com/HendrickDang/PRT661-DATA-SCIENCE-PRACTICE/commits?author=thomastran2k2</w:t>
+        </w:r>
+      </w:hyperlink>
       <w:r>
         <w:rPr>
           <w:rFonts w:ascii="Times New Roman" w:eastAsia="Times New Roman" w:hAnsi="Times New Roman"/>
@@ -3474,7 +3019,7 @@
         </w:rPr>
         <w:t>Documentation:</w:t>
       </w:r>
-      <w:hyperlink r:id="rId29" w:history="1">
+      <w:hyperlink r:id="rId30" w:history="1">
         <w:r>
           <w:rPr>
             <w:rStyle w:val="Hyperlink"/>
@@ -3522,7 +3067,7 @@
         </w:rPr>
         <w:t>:</w:t>
       </w:r>
-      <w:hyperlink r:id="rId30" w:history="1">
+      <w:hyperlink r:id="rId31" w:history="1">
         <w:r>
           <w:rPr>
             <w:rStyle w:val="Hyperlink"/>
@@ -3568,7 +3113,7 @@
         </w:rPr>
         <w:t xml:space="preserve">Jira: </w:t>
       </w:r>
-      <w:hyperlink r:id="rId31" w:history="1">
+      <w:hyperlink r:id="rId32" w:history="1">
         <w:r>
           <w:rPr>
             <w:rStyle w:val="Hyperlink"/>
@@ -3677,27 +3222,7 @@
           <w:szCs w:val="24"/>
           <w:lang w:val="en-AU"/>
         </w:rPr>
-        <w:t xml:space="preserve">Lab 2 (Week 4 materials) - Module 8: Storing and Organizing Data - Lab: Storing and </w:t>
-      </w:r>
-      <w:proofErr w:type="spellStart"/>
-      <w:r>
-        <w:rPr>
-          <w:rFonts w:ascii="Times New Roman" w:eastAsia="Times New Roman" w:hAnsi="Times New Roman"/>
-          <w:sz w:val="24"/>
-          <w:szCs w:val="24"/>
-          <w:lang w:val="en-AU"/>
-        </w:rPr>
-        <w:t>Analyzing</w:t>
-      </w:r>
-      <w:proofErr w:type="spellEnd"/>
-      <w:r>
-        <w:rPr>
-          <w:rFonts w:ascii="Times New Roman" w:eastAsia="Times New Roman" w:hAnsi="Times New Roman"/>
-          <w:sz w:val="24"/>
-          <w:szCs w:val="24"/>
-          <w:lang w:val="en-AU"/>
-        </w:rPr>
-        <w:t xml:space="preserve"> Data by Using Amazon Redshift</w:t>
+        <w:t>Lab 2 (Week 4 materials) - Module 8: Storing and Organizing Data - Lab: Storing and Analyzing Data by Using Amazon Redshift</w:t>
       </w:r>
     </w:p>
     <w:p>
@@ -3746,7 +3271,7 @@
                     </pic:cNvPicPr>
                   </pic:nvPicPr>
                   <pic:blipFill>
-                    <a:blip r:embed="rId32" cstate="print">
+                    <a:blip r:embed="rId33" cstate="print">
                       <a:extLst>
                         <a:ext uri="{28A0092B-C50C-407E-A947-70E740481C1C}">
                           <a14:useLocalDpi xmlns:a14="http://schemas.microsoft.com/office/drawing/2010/main" val="0"/>
@@ -3847,8 +3372,8 @@
       </w:pPr>
     </w:p>
     <w:sectPr>
-      <w:headerReference w:type="default" r:id="rId33"/>
-      <w:footerReference w:type="default" r:id="rId34"/>
+      <w:headerReference w:type="default" r:id="rId34"/>
+      <w:footerReference w:type="default" r:id="rId35"/>
       <w:pgSz w:w="11906" w:h="16838" w:code="9"/>
       <w:pgMar w:top="1440" w:right="1440" w:bottom="1440" w:left="1440" w:header="709" w:footer="709" w:gutter="0"/>
       <w:pgNumType w:start="0"/>
@@ -8057,6 +7582,21 @@
 </file>
 
 <file path=customXml/item2.xml><?xml version="1.0" encoding="utf-8"?>
+<p:properties xmlns:p="http://schemas.microsoft.com/office/2006/metadata/properties" xmlns:xsi="http://www.w3.org/2001/XMLSchema-instance" xmlns:pc="http://schemas.microsoft.com/office/infopath/2007/PartnerControls">
+  <documentManagement/>
+</p:properties>
+</file>
+
+<file path=customXml/item3.xml><?xml version="1.0" encoding="utf-8"?>
+<?mso-contentType ?>
+<FormTemplates xmlns="http://schemas.microsoft.com/sharepoint/v3/contenttype/forms">
+  <Display>DocumentLibraryForm</Display>
+  <Edit>DocumentLibraryForm</Edit>
+  <New>DocumentLibraryForm</New>
+</FormTemplates>
+</file>
+
+<file path=customXml/item4.xml><?xml version="1.0" encoding="utf-8"?>
 <ct:contentTypeSchema xmlns:ct="http://schemas.microsoft.com/office/2006/metadata/contentType" xmlns:ma="http://schemas.microsoft.com/office/2006/metadata/properties/metaAttributes" ct:_="" ma:_="" ma:contentTypeName="Document" ma:contentTypeID="0x010100922A3CA1EE6E4B44833A16005451862E" ma:contentTypeVersion="3" ma:contentTypeDescription="Create a new document." ma:contentTypeScope="" ma:versionID="b712dade4bf8bf57d4a0cdac4d020ae4">
   <xsd:schema xmlns:xsd="http://www.w3.org/2001/XMLSchema" xmlns:xs="http://www.w3.org/2001/XMLSchema" xmlns:p="http://schemas.microsoft.com/office/2006/metadata/properties" xmlns:ns2="92f6da62-8f25-40d3-824c-47c5f6f94bd6" targetNamespace="http://schemas.microsoft.com/office/2006/metadata/properties" ma:root="true" ma:fieldsID="f6f8642a0533a95cbf7fc7bbc8c1e153" ns2:_="">
     <xsd:import namespace="92f6da62-8f25-40d3-824c-47c5f6f94bd6"/>
@@ -8194,21 +7734,6 @@
 </ct:contentTypeSchema>
 </file>
 
-<file path=customXml/item3.xml><?xml version="1.0" encoding="utf-8"?>
-<?mso-contentType ?>
-<FormTemplates xmlns="http://schemas.microsoft.com/sharepoint/v3/contenttype/forms">
-  <Display>DocumentLibraryForm</Display>
-  <Edit>DocumentLibraryForm</Edit>
-  <New>DocumentLibraryForm</New>
-</FormTemplates>
-</file>
-
-<file path=customXml/item4.xml><?xml version="1.0" encoding="utf-8"?>
-<p:properties xmlns:p="http://schemas.microsoft.com/office/2006/metadata/properties" xmlns:xsi="http://www.w3.org/2001/XMLSchema-instance" xmlns:pc="http://schemas.microsoft.com/office/infopath/2007/PartnerControls">
-  <documentManagement/>
-</p:properties>
-</file>
-
 <file path=customXml/itemProps1.xml><?xml version="1.0" encoding="utf-8"?>
 <ds:datastoreItem xmlns:ds="http://schemas.openxmlformats.org/officeDocument/2006/customXml" ds:itemID="{E3DA75CE-018A-4AF1-8B5C-BF0FBFE76924}">
   <ds:schemaRefs>
@@ -8218,6 +7743,23 @@
 </file>
 
 <file path=customXml/itemProps2.xml><?xml version="1.0" encoding="utf-8"?>
+<ds:datastoreItem xmlns:ds="http://schemas.openxmlformats.org/officeDocument/2006/customXml" ds:itemID="{B2E31085-3E06-4A9F-9730-20A04C85DF24}">
+  <ds:schemaRefs>
+    <ds:schemaRef ds:uri="http://schemas.microsoft.com/office/2006/metadata/properties"/>
+    <ds:schemaRef ds:uri="http://schemas.microsoft.com/office/infopath/2007/PartnerControls"/>
+  </ds:schemaRefs>
+</ds:datastoreItem>
+</file>
+
+<file path=customXml/itemProps3.xml><?xml version="1.0" encoding="utf-8"?>
+<ds:datastoreItem xmlns:ds="http://schemas.openxmlformats.org/officeDocument/2006/customXml" ds:itemID="{82A9BB68-56B4-4822-B6B7-DB471576EB1F}">
+  <ds:schemaRefs>
+    <ds:schemaRef ds:uri="http://schemas.microsoft.com/sharepoint/v3/contenttype/forms"/>
+  </ds:schemaRefs>
+</ds:datastoreItem>
+</file>
+
+<file path=customXml/itemProps4.xml><?xml version="1.0" encoding="utf-8"?>
 <ds:datastoreItem xmlns:ds="http://schemas.openxmlformats.org/officeDocument/2006/customXml" ds:itemID="{69960CE0-24F5-4ADF-A12F-FE193FFA9C43}">
   <ds:schemaRefs>
     <ds:schemaRef ds:uri="http://schemas.microsoft.com/office/2006/metadata/contentType"/>
@@ -8233,21 +7775,4 @@
     <ds:schemaRef ds:uri="http://schemas.microsoft.com/internal/obd"/>
   </ds:schemaRefs>
 </ds:datastoreItem>
-</file>
-
-<file path=customXml/itemProps3.xml><?xml version="1.0" encoding="utf-8"?>
-<ds:datastoreItem xmlns:ds="http://schemas.openxmlformats.org/officeDocument/2006/customXml" ds:itemID="{82A9BB68-56B4-4822-B6B7-DB471576EB1F}">
-  <ds:schemaRefs>
-    <ds:schemaRef ds:uri="http://schemas.microsoft.com/sharepoint/v3/contenttype/forms"/>
-  </ds:schemaRefs>
-</ds:datastoreItem>
-</file>
-
-<file path=customXml/itemProps4.xml><?xml version="1.0" encoding="utf-8"?>
-<ds:datastoreItem xmlns:ds="http://schemas.openxmlformats.org/officeDocument/2006/customXml" ds:itemID="{B2E31085-3E06-4A9F-9730-20A04C85DF24}">
-  <ds:schemaRefs>
-    <ds:schemaRef ds:uri="http://schemas.microsoft.com/office/2006/metadata/properties"/>
-    <ds:schemaRef ds:uri="http://schemas.microsoft.com/office/infopath/2007/PartnerControls"/>
-  </ds:schemaRefs>
-</ds:datastoreItem>
 </file>
</xml_diff>